<commit_message>
Build checked review dossier and submission bundle with explicit assumptions
</commit_message>
<xml_diff>
--- a/Group_06_Arush_Ronit_Harshvardhan/docs/MDRIIA_Group_06_Technical_Dossier.docx
+++ b/Group_06_Arush_Ronit_Harshvardhan/docs/MDRIIA_Group_06_Technical_Dossier.docx
@@ -65,6 +65,14 @@
         </w:rPr>
         <w:t>Capstone ICA (20 marks): CDIO Robotics Engineering &amp; MuJoCo Physics 10 · CSBS Techno-Economic Business Systems Analysis 5 · Studio Showcase &amp; Viva Voce 5</w:t>
       </w:r>
+      <w:r>
+        <w:rPr>
+          <w:b/>
+          <w:color w:val="9C3025"/>
+        </w:rPr>
+        <w:br/>
+        <w:t>PRELIMINARY REVIEW COPY — final validation running; team fields unsigned.</w:t>
+      </w:r>
     </w:p>
     <w:tbl>
       <w:tblPr>
@@ -1142,7 +1150,6 @@
       </w:tr>
       <w:tr>
         <w:trPr>
-          <w:trHeight w:val="567" w:hRule="atLeast"/>
           <w:cantSplit/>
         </w:trPr>
         <w:tc>
@@ -1211,9 +1218,8 @@
                 <w:r>
                   <w:rPr>
                     <w:sz w:val="14"/>
-                    <w:szCs w:val="14"/>
                   </w:rPr>
-                  <w:t xml:space="preserve">type here</w:t>
+                  <w:t xml:space="preserve">No verified site-specific yield source obtained; delete numerical Mumbai claim. No electrical PV model is implemented.</w:t>
                 </w:r>
               </w:sdtContent>
             </w:sdt>
@@ -1237,7 +1243,7 @@
                 </w:rPr>
                 <w:alias w:val="M06.S1.claim1.source_type"/>
                 <w:tag w:val="M06.S1.claim1.source_type"/>
-                <w:dropDownList>
+                <w:dropDownList w:lastValue="No source found">
                   <w:listItem w:displayText="Select ▾" w:value=""/>
                   <w:listItem w:displayText="Standard (ISO / IEC / ANSI)" w:value="Standard (ISO / IEC / ANSI)"/>
                   <w:listItem w:displayText="Peer-reviewed paper (DOI)" w:value="Peer-reviewed paper (DOI)"/>
@@ -1251,9 +1257,8 @@
                 <w:r>
                   <w:rPr>
                     <w:sz w:val="14"/>
-                    <w:szCs w:val="14"/>
                   </w:rPr>
-                  <w:t xml:space="preserve">Select ▾</w:t>
+                  <w:t xml:space="preserve">No source found</w:t>
                 </w:r>
               </w:sdtContent>
             </w:sdt>
@@ -1277,7 +1282,7 @@
                 </w:rPr>
                 <w:alias w:val="M06.S1.claim1.verdict"/>
                 <w:tag w:val="M06.S1.claim1.verdict"/>
-                <w:dropDownList>
+                <w:dropDownList w:lastValue="Delete">
                   <w:listItem w:displayText="Select ▾" w:value=""/>
                   <w:listItem w:displayText="Keep" w:value="Keep"/>
                   <w:listItem w:displayText="Correct" w:value="Correct"/>
@@ -1288,9 +1293,8 @@
                 <w:r>
                   <w:rPr>
                     <w:sz w:val="14"/>
-                    <w:szCs w:val="14"/>
                   </w:rPr>
-                  <w:t xml:space="preserve">Select ▾</w:t>
+                  <w:t xml:space="preserve">Delete</w:t>
                 </w:r>
               </w:sdtContent>
             </w:sdt>
@@ -1299,7 +1303,6 @@
       </w:tr>
       <w:tr>
         <w:trPr>
-          <w:trHeight w:val="567" w:hRule="atLeast"/>
           <w:cantSplit/>
         </w:trPr>
         <w:tc>
@@ -1368,9 +1371,8 @@
                 <w:r>
                   <w:rPr>
                     <w:sz w:val="14"/>
-                    <w:szCs w:val="14"/>
                   </w:rPr>
-                  <w:t xml:space="preserve">type here</w:t>
+                  <w:t xml:space="preserve">No verified primary monthly-loss source obtained. Monthly loss cannot be multiplied by annual generation as an annual-average loss; delete.</w:t>
                 </w:r>
               </w:sdtContent>
             </w:sdt>
@@ -1394,7 +1396,7 @@
                 </w:rPr>
                 <w:alias w:val="M06.S1.claim2.source_type"/>
                 <w:tag w:val="M06.S1.claim2.source_type"/>
-                <w:dropDownList>
+                <w:dropDownList w:lastValue="No source found">
                   <w:listItem w:displayText="Select ▾" w:value=""/>
                   <w:listItem w:displayText="Standard (ISO / IEC / ANSI)" w:value="Standard (ISO / IEC / ANSI)"/>
                   <w:listItem w:displayText="Peer-reviewed paper (DOI)" w:value="Peer-reviewed paper (DOI)"/>
@@ -1408,9 +1410,8 @@
                 <w:r>
                   <w:rPr>
                     <w:sz w:val="14"/>
-                    <w:szCs w:val="14"/>
                   </w:rPr>
-                  <w:t xml:space="preserve">Select ▾</w:t>
+                  <w:t xml:space="preserve">No source found</w:t>
                 </w:r>
               </w:sdtContent>
             </w:sdt>
@@ -1434,7 +1435,7 @@
                 </w:rPr>
                 <w:alias w:val="M06.S1.claim2.verdict"/>
                 <w:tag w:val="M06.S1.claim2.verdict"/>
-                <w:dropDownList>
+                <w:dropDownList w:lastValue="Delete">
                   <w:listItem w:displayText="Select ▾" w:value=""/>
                   <w:listItem w:displayText="Keep" w:value="Keep"/>
                   <w:listItem w:displayText="Correct" w:value="Correct"/>
@@ -1445,9 +1446,8 @@
                 <w:r>
                   <w:rPr>
                     <w:sz w:val="14"/>
-                    <w:szCs w:val="14"/>
                   </w:rPr>
-                  <w:t xml:space="preserve">Select ▾</w:t>
+                  <w:t xml:space="preserve">Delete</w:t>
                 </w:r>
               </w:sdtContent>
             </w:sdt>
@@ -1456,7 +1456,6 @@
       </w:tr>
       <w:tr>
         <w:trPr>
-          <w:trHeight w:val="567" w:hRule="atLeast"/>
           <w:cantSplit/>
         </w:trPr>
         <w:tc>
@@ -1522,9 +1521,8 @@
                 <w:r>
                   <w:rPr>
                     <w:sz w:val="14"/>
-                    <w:szCs w:val="14"/>
                   </w:rPr>
-                  <w:t xml:space="preserve">type here</w:t>
+                  <w:t xml:space="preserve">No measured PV electrical recovery or sourced commercial payback supports these numbers. Delete; replace with explicitly assumed dimensionless scenario in Section 3.</w:t>
                 </w:r>
               </w:sdtContent>
             </w:sdt>
@@ -1547,7 +1545,7 @@
                 </w:rPr>
                 <w:alias w:val="M06.S1.claim3.source_type"/>
                 <w:tag w:val="M06.S1.claim3.source_type"/>
-                <w:dropDownList>
+                <w:dropDownList w:lastValue="No source found">
                   <w:listItem w:displayText="Select ▾" w:value=""/>
                   <w:listItem w:displayText="Standard (ISO / IEC / ANSI)" w:value="Standard (ISO / IEC / ANSI)"/>
                   <w:listItem w:displayText="Peer-reviewed paper (DOI)" w:value="Peer-reviewed paper (DOI)"/>
@@ -1561,9 +1559,8 @@
                 <w:r>
                   <w:rPr>
                     <w:sz w:val="14"/>
-                    <w:szCs w:val="14"/>
                   </w:rPr>
-                  <w:t xml:space="preserve">Select ▾</w:t>
+                  <w:t xml:space="preserve">No source found</w:t>
                 </w:r>
               </w:sdtContent>
             </w:sdt>
@@ -1586,7 +1583,7 @@
                 </w:rPr>
                 <w:alias w:val="M06.S1.claim3.verdict"/>
                 <w:tag w:val="M06.S1.claim3.verdict"/>
-                <w:dropDownList>
+                <w:dropDownList w:lastValue="Delete">
                   <w:listItem w:displayText="Select ▾" w:value=""/>
                   <w:listItem w:displayText="Keep" w:value="Keep"/>
                   <w:listItem w:displayText="Correct" w:value="Correct"/>
@@ -1597,9 +1594,8 @@
                 <w:r>
                   <w:rPr>
                     <w:sz w:val="14"/>
-                    <w:szCs w:val="14"/>
                   </w:rPr>
-                  <w:t xml:space="preserve">Select ▾</w:t>
+                  <w:t xml:space="preserve">Delete</w:t>
                 </w:r>
               </w:sdtContent>
             </w:sdt>
@@ -1857,7 +1853,7 @@
                 </w:rPr>
                 <w:alias w:val="M06.S1.std_iso10218.applies"/>
                 <w:tag w:val="M06.S1.std_iso10218.applies"/>
-                <w:dropDownList>
+                <w:dropDownList w:lastValue="No">
                   <w:listItem w:displayText="Select ▾" w:value=""/>
                   <w:listItem w:displayText="Yes" w:value="Yes"/>
                   <w:listItem w:displayText="Partly" w:value="Partly"/>
@@ -1868,9 +1864,8 @@
                 <w:r>
                   <w:rPr>
                     <w:sz w:val="14"/>
-                    <w:szCs w:val="14"/>
                   </w:rPr>
-                  <w:t xml:space="preserve">Select ▾</w:t>
+                  <w:t xml:space="preserve">No</w:t>
                 </w:r>
               </w:sdtContent>
             </w:sdt>
@@ -1900,9 +1895,8 @@
                 <w:r>
                   <w:rPr>
                     <w:sz w:val="14"/>
-                    <w:szCs w:val="14"/>
                   </w:rPr>
-                  <w:t xml:space="preserve">type here</w:t>
+                  <w:t xml:space="preserve">Scope: industrial robot/manipulator and integration. This fixed-panel cleaning mobile device is not an industrial manipulator; no conformity claim.</w:t>
                 </w:r>
               </w:sdtContent>
             </w:sdt>
@@ -1994,7 +1988,7 @@
                 </w:rPr>
                 <w:alias w:val="M06.S1.std_iso3691.applies"/>
                 <w:tag w:val="M06.S1.std_iso3691.applies"/>
-                <w:dropDownList>
+                <w:dropDownList w:lastValue="No">
                   <w:listItem w:displayText="Select ▾" w:value=""/>
                   <w:listItem w:displayText="Yes" w:value="Yes"/>
                   <w:listItem w:displayText="Partly" w:value="Partly"/>
@@ -2005,9 +1999,8 @@
                 <w:r>
                   <w:rPr>
                     <w:sz w:val="14"/>
-                    <w:szCs w:val="14"/>
                   </w:rPr>
-                  <w:t xml:space="preserve">Select ▾</w:t>
+                  <w:t xml:space="preserve">No</w:t>
                 </w:r>
               </w:sdtContent>
             </w:sdt>
@@ -2037,9 +2030,8 @@
                 <w:r>
                   <w:rPr>
                     <w:sz w:val="14"/>
-                    <w:szCs w:val="14"/>
                   </w:rPr>
-                  <w:t xml:space="preserve">type here</w:t>
+                  <w:t xml:space="preserve">Scope: driverless industrial trucks. The selected fixed PV-bay cleaner is not an industrial truck; no conformity claim.</w:t>
                 </w:r>
               </w:sdtContent>
             </w:sdt>
@@ -2131,7 +2123,7 @@
                 </w:rPr>
                 <w:alias w:val="M06.S1.std_ria.applies"/>
                 <w:tag w:val="M06.S1.std_ria.applies"/>
-                <w:dropDownList>
+                <w:dropDownList w:lastValue="No">
                   <w:listItem w:displayText="Select ▾" w:value=""/>
                   <w:listItem w:displayText="Yes" w:value="Yes"/>
                   <w:listItem w:displayText="Partly" w:value="Partly"/>
@@ -2142,9 +2134,8 @@
                 <w:r>
                   <w:rPr>
                     <w:sz w:val="14"/>
-                    <w:szCs w:val="14"/>
                   </w:rPr>
-                  <w:t xml:space="preserve">Select ▾</w:t>
+                  <w:t xml:space="preserve">No</w:t>
                 </w:r>
               </w:sdtContent>
             </w:sdt>
@@ -2174,9 +2165,8 @@
                 <w:r>
                   <w:rPr>
                     <w:sz w:val="14"/>
-                    <w:szCs w:val="14"/>
                   </w:rPr>
-                  <w:t xml:space="preserve">type here</w:t>
+                  <w:t xml:space="preserve">Industrial robot-system standard associated with ISO 10218; selected system is not an industrial manipulator. No compliance claim.</w:t>
                 </w:r>
               </w:sdtContent>
             </w:sdt>
@@ -2268,7 +2258,7 @@
                 </w:rPr>
                 <w:alias w:val="M06.S1.std_iec60601.applies"/>
                 <w:tag w:val="M06.S1.std_iec60601.applies"/>
-                <w:dropDownList>
+                <w:dropDownList w:lastValue="No">
                   <w:listItem w:displayText="Select ▾" w:value=""/>
                   <w:listItem w:displayText="Yes" w:value="Yes"/>
                   <w:listItem w:displayText="Partly" w:value="Partly"/>
@@ -2279,9 +2269,8 @@
                 <w:r>
                   <w:rPr>
                     <w:sz w:val="14"/>
-                    <w:szCs w:val="14"/>
                   </w:rPr>
-                  <w:t xml:space="preserve">Select ▾</w:t>
+                  <w:t xml:space="preserve">No</w:t>
                 </w:r>
               </w:sdtContent>
             </w:sdt>
@@ -2311,9 +2300,8 @@
                 <w:r>
                   <w:rPr>
                     <w:sz w:val="14"/>
-                    <w:szCs w:val="14"/>
                   </w:rPr>
-                  <w:t xml:space="preserve">type here</w:t>
+                  <w:t xml:space="preserve">Medical electrical equipment; the PV cleaner has no medical use. No applicable medical requirement.</w:t>
                 </w:r>
               </w:sdtContent>
             </w:sdt>
@@ -2401,7 +2389,7 @@
                 </w:rPr>
                 <w:alias w:val="M06.S1.std_domain.applies"/>
                 <w:tag w:val="M06.S1.std_domain.applies"/>
-                <w:dropDownList>
+                <w:dropDownList w:lastValue="Partly">
                   <w:listItem w:displayText="Select ▾" w:value=""/>
                   <w:listItem w:displayText="Yes" w:value="Yes"/>
                   <w:listItem w:displayText="Partly" w:value="Partly"/>
@@ -2412,9 +2400,8 @@
                 <w:r>
                   <w:rPr>
                     <w:sz w:val="14"/>
-                    <w:szCs w:val="14"/>
                   </w:rPr>
-                  <w:t xml:space="preserve">Select ▾</w:t>
+                  <w:t xml:space="preserve">Partly</w:t>
                 </w:r>
               </w:sdtContent>
             </w:sdt>
@@ -2443,9 +2430,8 @@
                 <w:r>
                   <w:rPr>
                     <w:sz w:val="14"/>
-                    <w:szCs w:val="14"/>
                   </w:rPr>
-                  <w:t xml:space="preserve">type here</w:t>
+                  <w:t xml:space="preserve">IEC 61215 (PV module qualification) and IEC 61730 (module safety) are relevant to future module/cleaner compatibility. Licensed clauses and allowable local brush/wheel loads were not verified; no clause number, certified glass load or compliance is asserted.</w:t>
                 </w:r>
               </w:sdtContent>
             </w:sdt>
@@ -2534,10 +2520,9 @@
               <w:sdtContent>
                 <w:r>
                   <w:rPr>
-                    <w:sz w:val="15"/>
-                    <w:szCs w:val="15"/>
+                    <w:sz w:val="14"/>
                   </w:rPr>
-                  <w:t xml:space="preserve">type here</w:t>
+                  <w:t xml:space="preserve">Measured simulation baseline: waypoint + proportional wheel control; compare at equal 0–30 s exposure. Commercial reference: 120 person-hours/month is an assumption, not a site measurement.</w:t>
                 </w:r>
               </w:sdtContent>
             </w:sdt>
@@ -2593,10 +2578,9 @@
               <w:sdtContent>
                 <w:r>
                   <w:rPr>
-                    <w:sz w:val="15"/>
-                    <w:szCs w:val="15"/>
+                    <w:sz w:val="14"/>
                   </w:rPr>
-                  <w:t xml:space="preserve">type here</w:t>
+                  <w:t xml:space="preserve">Actual controller logs and frozen protocol; commercial assumptions in analytics/final_business_inputs.json. No Mumbai field survey or verified annual-yield figure.</w:t>
                 </w:r>
               </w:sdtContent>
             </w:sdt>
@@ -2650,10 +2634,9 @@
               <w:sdtContent>
                 <w:r>
                   <w:rPr>
-                    <w:sz w:val="15"/>
-                    <w:szCs w:val="15"/>
+                    <w:sz w:val="14"/>
                   </w:rPr>
-                  <w:t xml:space="preserve">type here</w:t>
+                  <w:t xml:space="preserve">Rooftop PV owner/operator and cleaning contractor; access, inspection, transfer and maintenance remain human responsibilities in the business scenario.</w:t>
                 </w:r>
               </w:sdtContent>
             </w:sdt>
@@ -2784,19 +2767,8 @@
             <w:tcW w:type="dxa" w:w="7597"/>
           </w:tcPr>
           <w:p>
-            <w:pPr>
-              <w:keepNext/>
-              <w:spacing w:after="0"/>
-            </w:pPr>
-            <w:r/>
             <w:r>
-              <w:rPr>
-                <w:b w:val="0"/>
-                <w:i w:val="0"/>
-                <w:color w:val="000000"/>
-                <w:sz w:val="14"/>
-              </w:rPr>
-              <w:t>Group_06_Arush_Ronit_Harshvardhan/models/solar_cleaning_crawler.xml</w:t>
+              <w:t>Group_06_Arush_Ronit_Harshvardhan/models/collection_cleaning_crawler.xml</w:t>
             </w:r>
           </w:p>
         </w:tc>
@@ -2880,19 +2852,8 @@
             <w:tcW w:type="dxa" w:w="7597"/>
           </w:tcPr>
           <w:p>
-            <w:pPr>
-              <w:keepNext/>
-              <w:spacing w:after="0"/>
-            </w:pPr>
-            <w:r/>
             <w:r>
-              <w:rPr>
-                <w:b w:val="0"/>
-                <w:i w:val="0"/>
-                <w:color w:val="000000"/>
-                <w:sz w:val="14"/>
-              </w:rPr>
-              <w:t>timestep 0.002 s (500 Hz) · track–glass friction 1.8 / 0.08 / 0.005 · panel 0.4 / 0.005 / 0.0001 · solref 0.005 1.0 · solimp 0.9 0.95 0.001 0.5 2 · 4 actuators</w:t>
+              <w:t>Final model: 0.002 s, five actuators (four driven rollers approximating tracks + one rotary brush). Brush capsule contact priority 2; separate stiff solid contact; zero-friction physical containment guards. See final parameter controls below.</w:t>
             </w:r>
           </w:p>
         </w:tc>
@@ -2928,19 +2889,8 @@
             <w:tcW w:type="dxa" w:w="7597"/>
           </w:tcPr>
           <w:p>
-            <w:pPr>
-              <w:keepNext/>
-              <w:spacing w:after="0"/>
-            </w:pPr>
-            <w:r/>
             <w:r>
-              <w:rPr>
-                <w:b w:val="0"/>
-                <w:i w:val="0"/>
-                <w:color w:val="000000"/>
-                <w:sz w:val="14"/>
-              </w:rPr>
-              <w:t>DOCKED → SWEEP_RIGHT → ROW_SHIFT (down-slope) → SWEEP_LEFT → … → RETURN → DOCKED; drift correction active in every sweep</w:t>
+              <w:t>Monitor actual RGB → persistent dirt trigger → sweep + requested bottom-edge task → image verification/revisit → return → settle → dock service. No endless loop on a clean scene.</w:t>
             </w:r>
           </w:p>
         </w:tc>
@@ -2975,26 +2925,8 @@
             <w:tcW w:type="dxa" w:w="7597"/>
           </w:tcPr>
           <w:p>
-            <w:pPr>
-              <w:spacing w:after="0"/>
-            </w:pPr>
-            <w:r/>
             <w:r>
-              <w:rPr>
-                <w:b w:val="0"/>
-                <w:i w:val="0"/>
-                <w:color w:val="000000"/>
-                <w:sz w:val="14"/>
-              </w:rPr>
-              <w:t>Newton-Euler (rigid body): m·v̇ = ΣF,  I·ω̇ + ω × (I·ω) = Στ;  multibody form M(q)·q̈ + C(q, q̇)·q̇ + g(q) = τ + Jᵀ·f_ext</w:t>
-              <w:br/>
-              <w:t>No-slip condition on tilt α: μ·(m·g·cosα + F_adh) ≥ m·g·sinα</w:t>
-              <w:br/>
-              <w:t>PI drift correction: Δv = K_p·e_y + K_i·∫e_y dt  (K_p = 1.8 in code);  coverage = cleaned area / panel area</w:t>
-              <w:br/>
-              <w:t>PID tracking: u(t) = K_p·e(t) + K_i·∫e dt + K_d·ė(t)</w:t>
-              <w:br/>
-              <w:t>Damped least-squares IK (manipulators): Δq = Jᵀ·(J·Jᵀ + λ²·I)⁻¹·Δx</w:t>
+              <w:t>Rigid-body dynamics: M(q)q̈ + C(q,q̇)q̇ + g(q) = τ + Jᵀf. Ideal uphill no-slip bound: μmg cosθ ≥ mg sinθ, with Fadh=0. Wheel PI drives four roller motors; heading error creates differential wheel-speed references. Coverage is qualifying brush footprint / 24 m². Dust disappearance uses a contact-gated reduced-order removal model, not granular dust/airflow dynamics.</w:t>
             </w:r>
           </w:p>
         </w:tc>
@@ -3011,13 +2943,7 @@
         <w:spacing w:after="40" w:before="0"/>
       </w:pPr>
       <w:r>
-        <w:rPr>
-          <w:b w:val="0"/>
-          <w:i/>
-          <w:color w:val="333333"/>
-          <w:sz w:val="15"/>
-        </w:rPr>
-        <w:t>Faculty code audit: Your ROI script uses 16.8% monthly soiling loss; your title sheet uses 16%. Use one sourced value.</w:t>
+        <w:t>Audit correction: inherited 16–16.8% soiling and 15.2–16.2% restoration constants are excluded from the final analysis; there is no PV electrical model.</w:t>
       </w:r>
     </w:p>
     <w:p>
@@ -3096,10 +3022,9 @@
               <w:sdtContent>
                 <w:r>
                   <w:rPr>
-                    <w:sz w:val="15"/>
-                    <w:szCs w:val="15"/>
+                    <w:sz w:val="14"/>
                   </w:rPr>
-                  <w:t xml:space="preserve">type here</w:t>
+                  <w:t xml:space="preserve">0.002 s; 500 Hz integration and logging</w:t>
                 </w:r>
               </w:sdtContent>
             </w:sdt>
@@ -3155,10 +3080,9 @@
               <w:sdtContent>
                 <w:r>
                   <w:rPr>
-                    <w:sz w:val="15"/>
-                    <w:szCs w:val="15"/>
+                    <w:sz w:val="14"/>
                   </w:rPr>
-                  <w:t xml:space="preserve">type here</w:t>
+                  <w:t xml:space="preserve">Rollers 1.2 / 0.005 / 0.0001; glass and brush 0.4 / 0.005 / 0.0001; brush contact priority 2. Guard friction is zero. These are model assumptions, not measured tyre/glass properties.</w:t>
                 </w:r>
               </w:sdtContent>
             </w:sdt>
@@ -3214,10 +3138,9 @@
               <w:sdtContent>
                 <w:r>
                   <w:rPr>
-                    <w:sz w:val="15"/>
-                    <w:szCs w:val="15"/>
+                    <w:sz w:val="14"/>
                   </w:rPr>
-                  <w:t xml:space="preserve">type here</w:t>
+                  <w:t xml:space="preserve">Brush/glass 0.02 s, 1 (soft bristle approximation); guide 0.01 s, 1; model default 0.005 s, 1. Rounded capsule contact was retained after replay rejected rigid-cylinder kicks. No coating-safety inference.</w:t>
                 </w:r>
               </w:sdtContent>
             </w:sdt>
@@ -3268,7 +3191,7 @@
                 </w:rPr>
                 <w:alias w:val="M06.S2.control_law"/>
                 <w:tag w:val="M06.S2.control_law"/>
-                <w:dropDownList>
+                <w:dropDownList w:lastValue="PI / PD">
                   <w:listItem w:displayText="Select ▾" w:value=""/>
                   <w:listItem w:displayText="PID" w:value="PID"/>
                   <w:listItem w:displayText="PI / PD" w:value="PI / PD"/>
@@ -3281,10 +3204,9 @@
               <w:sdtContent>
                 <w:r>
                   <w:rPr>
-                    <w:sz w:val="15"/>
-                    <w:szCs w:val="15"/>
+                    <w:sz w:val="14"/>
                   </w:rPr>
-                  <w:t xml:space="preserve">Select ▾</w:t>
+                  <w:t xml:space="preserve">PI / PD</w:t>
                 </w:r>
               </w:sdtContent>
             </w:sdt>
@@ -3340,10 +3262,9 @@
               <w:sdtContent>
                 <w:r>
                   <w:rPr>
-                    <w:sz w:val="15"/>
-                    <w:szCs w:val="15"/>
+                    <w:sz w:val="14"/>
                   </w:rPr>
-                  <w:t xml:space="preserve">type here</w:t>
+                  <w:t xml:space="preserve">Wheel PI: Kp=0.8 N·m/(rad/s), Ki=0.5 N·m/rad, integral clamp ±3 rad, motor ±3 N·m. Heading 3 s⁻¹, yaw command ±1.2 rad/s. Shared incline/return regulator Kp=0.6, Ki=0.2; torque ±1 N·m, slew 4 N·m/s. Brush velocity target 15 rad/s, kv=0.1, torque ±1 N·m.</w:t>
                 </w:r>
               </w:sdtContent>
             </w:sdt>
@@ -3399,10 +3320,9 @@
               <w:sdtContent>
                 <w:r>
                   <w:rPr>
-                    <w:sz w:val="15"/>
-                    <w:szCs w:val="15"/>
+                    <w:sz w:val="14"/>
                   </w:rPr>
-                  <w:t xml:space="preserve">type here</w:t>
+                  <w:t xml:space="preserve">HOME_MONITOR → SETTLE/ALIGN → SWEEP; image-requested EDGE_CLEAN_BOTTOM; verification/revisit; RETURN_HOME → DOCKING → DOCK_SERVICE → DOCKED. Safety abort/timeout remain failed outcomes.</w:t>
                 </w:r>
               </w:sdtContent>
             </w:sdt>
@@ -3451,7 +3371,7 @@
                 </w:rPr>
                 <w:alias w:val="M06.S2.model_loads"/>
                 <w:tag w:val="M06.S2.model_loads"/>
-                <w:dropDownList>
+                <w:dropDownList w:lastValue="Yes">
                   <w:listItem w:displayText="Select ▾" w:value=""/>
                   <w:listItem w:displayText="Yes" w:value="Yes"/>
                   <w:listItem w:displayText="No" w:value="No"/>
@@ -3460,10 +3380,9 @@
               <w:sdtContent>
                 <w:r>
                   <w:rPr>
-                    <w:sz w:val="15"/>
-                    <w:szCs w:val="15"/>
+                    <w:sz w:val="14"/>
                   </w:rPr>
-                  <w:t xml:space="preserve">Select ▾</w:t>
+                  <w:t xml:space="preserve">Yes</w:t>
                 </w:r>
               </w:sdtContent>
             </w:sdt>
@@ -3622,19 +3541,8 @@
             <w:tcW w:type="dxa" w:w="3061"/>
           </w:tcPr>
           <w:p>
-            <w:pPr>
-              <w:keepNext/>
-              <w:spacing w:after="0"/>
-            </w:pPr>
-            <w:r/>
             <w:r>
-              <w:rPr>
-                <w:b w:val="0"/>
-                <w:i w:val="0"/>
-                <w:color w:val="000000"/>
-                <w:sz w:val="14"/>
-              </w:rPr>
-              <w:t>models/solar_cleaning_crawler.xml</w:t>
+              <w:t>models/collection_cleaning_crawler.xml</w:t>
             </w:r>
           </w:p>
         </w:tc>
@@ -3668,7 +3576,7 @@
                 <w:r>
                   <w:rPr>
                     <w:sz w:val="14"/>
-                    <w:szCs w:val="14"/>
+                    <w:highlight w:val="yellow"/>
                   </w:rPr>
                   <w:t xml:space="preserve">Select ▾</w:t>
                 </w:r>
@@ -3706,7 +3614,7 @@
                 <w:r>
                   <w:rPr>
                     <w:sz w:val="14"/>
-                    <w:szCs w:val="14"/>
+                    <w:highlight w:val="yellow"/>
                   </w:rPr>
                   <w:t xml:space="preserve">Select ▾</w:t>
                 </w:r>
@@ -3738,9 +3646,8 @@
                 <w:r>
                   <w:rPr>
                     <w:sz w:val="14"/>
-                    <w:szCs w:val="14"/>
                   </w:rPr>
-                  <w:t xml:space="preserve">type here</w:t>
+                  <w:t xml:space="preserve">Active model is collection_cleaning_crawler.xml: off-glass dock, capsule brush, fixed support/guide, tray; 8.5 kg robot and 5 actuators. AI-assisted development; member authorship pending.</w:t>
                 </w:r>
               </w:sdtContent>
             </w:sdt>
@@ -3802,7 +3709,7 @@
                 <w:r>
                   <w:rPr>
                     <w:sz w:val="14"/>
-                    <w:szCs w:val="14"/>
+                    <w:highlight w:val="yellow"/>
                   </w:rPr>
                   <w:t xml:space="preserve">Select ▾</w:t>
                 </w:r>
@@ -3840,7 +3747,7 @@
                 <w:r>
                   <w:rPr>
                     <w:sz w:val="14"/>
-                    <w:szCs w:val="14"/>
+                    <w:highlight w:val="yellow"/>
                   </w:rPr>
                   <w:t xml:space="preserve">Select ▾</w:t>
                 </w:r>
@@ -3872,9 +3779,8 @@
                 <w:r>
                   <w:rPr>
                     <w:sz w:val="14"/>
-                    <w:szCs w:val="14"/>
                   </w:rPr>
-                  <w:t xml:space="preserve">type here</w:t>
+                  <w:t xml:space="preserve">Camera-gated departure, PI tracking, safe turns/return, contact-gated brush, 500 Hz actual torque logging. AI-assisted; member authorship pending.</w:t>
                 </w:r>
               </w:sdtContent>
             </w:sdt>
@@ -3890,19 +3796,8 @@
             <w:tcW w:type="dxa" w:w="3061"/>
           </w:tcPr>
           <w:p>
-            <w:pPr>
-              <w:keepNext/>
-              <w:spacing w:after="0"/>
-            </w:pPr>
-            <w:r/>
             <w:r>
-              <w:rPr>
-                <w:b w:val="0"/>
-                <w:i w:val="0"/>
-                <w:color w:val="000000"/>
-                <w:sz w:val="14"/>
-              </w:rPr>
-              <w:t>analytics/photovoltaic_degradation_economics.py</w:t>
+              <w:t>analytics/final_business_model.py</w:t>
             </w:r>
           </w:p>
         </w:tc>
@@ -3936,7 +3831,7 @@
                 <w:r>
                   <w:rPr>
                     <w:sz w:val="14"/>
-                    <w:szCs w:val="14"/>
+                    <w:highlight w:val="yellow"/>
                   </w:rPr>
                   <w:t xml:space="preserve">Select ▾</w:t>
                 </w:r>
@@ -3974,7 +3869,7 @@
                 <w:r>
                   <w:rPr>
                     <w:sz w:val="14"/>
-                    <w:szCs w:val="14"/>
+                    <w:highlight w:val="yellow"/>
                   </w:rPr>
                   <w:t xml:space="preserve">Select ▾</w:t>
                 </w:r>
@@ -4006,9 +3901,8 @@
                 <w:r>
                   <w:rPr>
                     <w:sz w:val="14"/>
-                    <w:szCs w:val="14"/>
                   </w:rPr>
-                  <w:t xml:space="preserve">type here</w:t>
+                  <w:t xml:space="preserve">Replaced unsupported PV percentages with measured-throughput, dimensionless scenario, explicit human transfer labour and sensitivity. Member authorship pending.</w:t>
                 </w:r>
               </w:sdtContent>
             </w:sdt>
@@ -4043,9 +3937,8 @@
                 <w:r>
                   <w:rPr>
                     <w:sz w:val="14"/>
-                    <w:szCs w:val="14"/>
                   </w:rPr>
-                  <w:t xml:space="preserve">type here</w:t>
+                  <w:t xml:space="preserve">src/vision_mission.py + panel_vision.py</w:t>
                 </w:r>
               </w:sdtContent>
             </w:sdt>
@@ -4081,7 +3974,7 @@
                 <w:r>
                   <w:rPr>
                     <w:sz w:val="14"/>
-                    <w:szCs w:val="14"/>
+                    <w:highlight w:val="yellow"/>
                   </w:rPr>
                   <w:t xml:space="preserve">Select ▾</w:t>
                 </w:r>
@@ -4119,7 +4012,7 @@
                 <w:r>
                   <w:rPr>
                     <w:sz w:val="14"/>
-                    <w:szCs w:val="14"/>
+                    <w:highlight w:val="yellow"/>
                   </w:rPr>
                   <w:t xml:space="preserve">Select ▾</w:t>
                 </w:r>
@@ -4151,9 +4044,8 @@
                 <w:r>
                   <w:rPr>
                     <w:sz w:val="14"/>
-                    <w:szCs w:val="14"/>
                   </w:rPr>
-                  <w:t xml:space="preserve">type here</w:t>
+                  <w:t xml:space="preserve">Real rendered RGB observations, persistence gate, camera-target revisits and final independent scoring. Ground-truth navigation disclosed; member authorship pending.</w:t>
                 </w:r>
               </w:sdtContent>
             </w:sdt>
@@ -4187,9 +4079,8 @@
                 <w:r>
                   <w:rPr>
                     <w:sz w:val="14"/>
-                    <w:szCs w:val="14"/>
                   </w:rPr>
-                  <w:t xml:space="preserve">type here</w:t>
+                  <w:t xml:space="preserve">src/run_final_validation.py</w:t>
                 </w:r>
               </w:sdtContent>
             </w:sdt>
@@ -4224,7 +4115,7 @@
                 <w:r>
                   <w:rPr>
                     <w:sz w:val="14"/>
-                    <w:szCs w:val="14"/>
+                    <w:highlight w:val="yellow"/>
                   </w:rPr>
                   <w:t xml:space="preserve">Select ▾</w:t>
                 </w:r>
@@ -4261,7 +4152,7 @@
                 <w:r>
                   <w:rPr>
                     <w:sz w:val="14"/>
-                    <w:szCs w:val="14"/>
+                    <w:highlight w:val="yellow"/>
                   </w:rPr>
                   <w:t xml:space="preserve">Select ▾</w:t>
                 </w:r>
@@ -4292,9 +4183,8 @@
                 <w:r>
                   <w:rPr>
                     <w:sz w:val="14"/>
-                    <w:szCs w:val="14"/>
                   </w:rPr>
-                  <w:t xml:space="preserve">type here</w:t>
+                  <w:t xml:space="preserve">Frozen 180 full-mission attempts over 3 tilts with independent seeds, raw torques and source snapshots; no generated targets. Member authorship pending.</w:t>
                 </w:r>
               </w:sdtContent>
             </w:sdt>
@@ -4335,7 +4225,6 @@
       </w:tblGrid>
       <w:tr>
         <w:trPr>
-          <w:trHeight w:val="2608" w:hRule="exact"/>
           <w:cantSplit/>
         </w:trPr>
         <w:tc>
@@ -4343,19 +4232,24 @@
             <w:tcW w:type="dxa" w:w="10205"/>
           </w:tcPr>
           <w:p>
-            <w:pPr>
-              <w:spacing w:after="0"/>
-              <w:jc w:val="center"/>
-            </w:pPr>
-            <w:r/>
             <w:r>
               <w:rPr>
-                <w:b w:val="0"/>
-                <w:i/>
-                <w:color w:val="595959"/>
-                <w:sz w:val="15"/>
+                <w:rFonts w:ascii="Consolas" w:hAnsi="Consolas"/>
+                <w:sz w:val="16"/>
               </w:rPr>
-              <w:t>[ Paste code as text (Consolas 8 pt), not a screenshot. Include the file name and line numbers. ]</w:t>
+              <w:t>src/crawler_cleaning_controller.py, lines 180–185</w:t>
+              <w:br/>
+              <w:t xml:space="preserve">                for i,j in enumerate(joints):</w:t>
+              <w:br/>
+              <w:t xml:space="preserve">                    e=speeds[i]-d.qvel[j]</w:t>
+              <w:br/>
+              <w:t xml:space="preserve">                    integral[i]=np.clip(integral[i]+e*dt,-3,3)</w:t>
+              <w:br/>
+              <w:t xml:space="preserve">                    d.ctrl[i]=np.clip(.8*e+(.5*integral[i] if variant=="proposed" else 0),-3,3)</w:t>
+              <w:br/>
+              <w:t xml:space="preserve">            d.ctrl[4]=15 if state in ('SWEEP','EDGE_CLEAN_BOTTOM') else 0</w:t>
+              <w:br/>
+              <w:t xml:space="preserve">            mujoco.mj_forward(m,d)</w:t>
             </w:r>
           </w:p>
         </w:tc>
@@ -4394,7 +4288,6 @@
       </w:tblGrid>
       <w:tr>
         <w:trPr>
-          <w:trHeight w:val="2381" w:hRule="exact"/>
           <w:cantSplit/>
         </w:trPr>
         <w:tc>
@@ -4402,19 +4295,53 @@
             <w:tcW w:type="dxa" w:w="10205"/>
           </w:tcPr>
           <w:p>
-            <w:pPr>
-              <w:spacing w:after="0"/>
-              <w:jc w:val="center"/>
-            </w:pPr>
-            <w:r/>
+            <w:r/>
+            <w:r>
+              <w:drawing>
+                <wp:inline xmlns:a="http://schemas.openxmlformats.org/drawingml/2006/main" xmlns:pic="http://schemas.openxmlformats.org/drawingml/2006/picture">
+                  <wp:extent cx="5212080" cy="1498473"/>
+                  <wp:docPr id="1" name="Picture 1"/>
+                  <wp:cNvGraphicFramePr>
+                    <a:graphicFrameLocks noChangeAspect="1"/>
+                  </wp:cNvGraphicFramePr>
+                  <a:graphic>
+                    <a:graphicData uri="http://schemas.openxmlformats.org/drawingml/2006/picture">
+                      <pic:pic>
+                        <pic:nvPicPr>
+                          <pic:cNvPr id="0" name="free_body.png"/>
+                          <pic:cNvPicPr/>
+                        </pic:nvPicPr>
+                        <pic:blipFill>
+                          <a:blip r:embed="rId10"/>
+                          <a:stretch>
+                            <a:fillRect/>
+                          </a:stretch>
+                        </pic:blipFill>
+                        <pic:spPr>
+                          <a:xfrm>
+                            <a:off x="0" y="0"/>
+                            <a:ext cx="5212080" cy="1498473"/>
+                          </a:xfrm>
+                          <a:prstGeom prst="rect"/>
+                        </pic:spPr>
+                      </pic:pic>
+                    </a:graphicData>
+                  </a:graphic>
+                </wp:inline>
+              </w:drawing>
+            </w:r>
+          </w:p>
+          <w:p>
             <w:r>
               <w:rPr>
-                <w:b w:val="0"/>
-                <w:i/>
-                <w:color w:val="595959"/>
-                <w:sz w:val="15"/>
+                <w:sz w:val="14"/>
               </w:rPr>
-              <w:t>[ FBD (phone photo of a hand sketch is fine) → symbols explained → worked example → where this value appears in your telemetry CSV ]</w:t>
+              <w:t>Panel-tangent free-body idealisation; guard and brush contact are distinct from wheel normal load.</w:t>
+            </w:r>
+          </w:p>
+          <w:p>
+            <w:r>
+              <w:t>m=8.5 kg, g=9.81 m/s², θ=20°: mg=83.385 N; mg sinθ=28.519 N; mg cosθ=78.355 N; ideal μmin=tan20°=0.364. No suction adhesion is simulated. These equilibrium values do not prove traction or glass safety. Actual brush normal load is brush_normal_N, guard load is guard_normal_N and panel velocities are vx/vy_panel_mps in raw CSV. Torque effort is Στ²Δt; positive mechanical work is ∫max(τq̇,0)dt. Electrical energy additionally requires declared efficiency and auxiliary-power assumptions.</w:t>
             </w:r>
           </w:p>
         </w:tc>
@@ -4510,19 +4437,8 @@
             <w:tcW w:type="dxa" w:w="7597"/>
           </w:tcPr>
           <w:p>
-            <w:pPr>
-              <w:keepNext/>
-              <w:spacing w:after="0"/>
-            </w:pPr>
-            <w:r/>
             <w:r>
-              <w:rPr>
-                <w:b w:val="0"/>
-                <w:i w:val="0"/>
-                <w:color w:val="000000"/>
-                <w:sz w:val="14"/>
-              </w:rPr>
-              <w:t>Group_06_Arush_Ronit_Harshvardhan/analytics/photovoltaic_degradation_economics.py  (rename or add *_roi.py if you restructure it)</w:t>
+              <w:t>Group_06_Arush_Ronit_Harshvardhan/analytics/final_business_model.py</w:t>
             </w:r>
           </w:p>
         </w:tc>
@@ -4558,19 +4474,8 @@
             <w:tcW w:type="dxa" w:w="7597"/>
           </w:tcPr>
           <w:p>
-            <w:pPr>
-              <w:keepNext/>
-              <w:spacing w:after="0"/>
-            </w:pPr>
-            <w:r/>
             <w:r>
-              <w:rPr>
-                <w:b w:val="0"/>
-                <w:i w:val="0"/>
-                <w:color w:val="000000"/>
-                <w:sz w:val="14"/>
-              </w:rPr>
-              <w:t>CSBS Renewable Energy Financial Modeling: A 100 kWp commercial rooftop PV array in Mumbai generates ~140,000 kWh annually. A 16% monthly soiling loss forfeits 22,400 kWh/year (substantial commercial revenue loss). Manual cleaning requires recurring contractor fees, consumes thousands of liters of treated water, and poses safety liabilities. The autonomous crawler performs daily waterless cleaning during low-irradiance hours, increasing net energy yield by 15.2% and achieving full equipment CapEx payback within 8.6 months.</w:t>
+              <w:t>Final operational scenario: one 24 m² tilted bay is cleaned after controlled RGB detection; manual transfer between bays is explicitly charged as human labour. No site-specific PV generation, water saving, electrical-yield recovery or commercial payback is established. The three inherited numerical claims in Section 1 are deleted.</w:t>
             </w:r>
           </w:p>
         </w:tc>
@@ -4606,19 +4511,8 @@
             <w:tcW w:type="dxa" w:w="7597"/>
           </w:tcPr>
           <w:p>
-            <w:pPr>
-              <w:keepNext/>
-              <w:spacing w:after="0"/>
-            </w:pPr>
-            <w:r/>
             <w:r>
-              <w:rPr>
-                <w:b w:val="0"/>
-                <w:i w:val="0"/>
-                <w:color w:val="000000"/>
-                <w:sz w:val="14"/>
-              </w:rPr>
-              <w:t>monthly_soiling_loss_pct = 16.8, restored_power_pct = 16.2, water_abatement_pct = 100.0, c_crawler_opex = 0.28, k_capex_normalized = 0.65  →  each one needs a source in 3.1 or must be computed from your simulation.</w:t>
+              <w:t>Commercial inputs are explicitly labelled assumptions in final_business_inputs.json and varied in sensitivity.csv. Throughput/mechanical-work inputs come from the named actual simulation dataset. Modelled blower/auxiliary wattages and efficiency are assumptions; they are not electrical measurements.</w:t>
             </w:r>
           </w:p>
         </w:tc>
@@ -4814,7 +4708,6 @@
       </w:tr>
       <w:tr>
         <w:trPr>
-          <w:trHeight w:val="567" w:hRule="atLeast"/>
           <w:cantSplit/>
         </w:trPr>
         <w:tc>
@@ -4883,9 +4776,8 @@
                 <w:r>
                   <w:rPr>
                     <w:sz w:val="14"/>
-                    <w:szCs w:val="14"/>
                   </w:rPr>
-                  <w:t xml:space="preserve">type here</w:t>
+                  <w:t xml:space="preserve">PROVISIONAL calibration: one validated nominal run; final batch pending. H0=120 h/month; 21 sections/day × 30 days; f=0.2; attempt mean 610.858 s; p=1; transfer=180 s/section fully human; recovery=180 s/failure fully human; maintenance=10 h/month. All commercial values are assumptions.</w:t>
                 </w:r>
               </w:sdtContent>
             </w:sdt>
@@ -4915,9 +4807,8 @@
                 <w:r>
                   <w:rPr>
                     <w:sz w:val="14"/>
-                    <w:szCs w:val="14"/>
                   </w:rPr>
-                  <w:t xml:space="preserve">type here</w:t>
+                  <w:t xml:space="preserve">57.12 person-h/month; robot-related human effort 62.88 h/month (monitoring + transfer/recovery + maintenance).</w:t>
                 </w:r>
               </w:sdtContent>
             </w:sdt>
@@ -4926,7 +4817,6 @@
       </w:tr>
       <w:tr>
         <w:trPr>
-          <w:trHeight w:val="567" w:hRule="atLeast"/>
           <w:cantSplit/>
         </w:trPr>
         <w:tc>
@@ -4995,9 +4885,8 @@
                 <w:r>
                   <w:rPr>
                     <w:sz w:val="14"/>
-                    <w:szCs w:val="14"/>
                   </w:rPr>
-                  <w:t xml:space="preserve">type here</w:t>
+                  <w:t xml:space="preserve">Normalise one year of baseline labour cost to 1. CapEx ratio k=0.65; life L=5 years; annual saving ratio s=NCRI. All commercial inputs assumed. T=12k/s months; P=k/(L·s); undefined for s≤0.</w:t>
                 </w:r>
               </w:sdtContent>
             </w:sdt>
@@ -5027,9 +4916,8 @@
                 <w:r>
                   <w:rPr>
                     <w:sz w:val="14"/>
-                    <w:szCs w:val="14"/>
                   </w:rPr>
-                  <w:t xml:space="preserve">type here</w:t>
+                  <w:t xml:space="preserve">T=20.491 months; P=0.34152 (dimensionless). Scenario output, not observed payback.</w:t>
                 </w:r>
               </w:sdtContent>
             </w:sdt>
@@ -5038,7 +4926,6 @@
       </w:tr>
       <w:tr>
         <w:trPr>
-          <w:trHeight w:val="567" w:hRule="atLeast"/>
           <w:cantSplit/>
         </w:trPr>
         <w:tc>
@@ -5107,9 +4994,8 @@
                 <w:r>
                   <w:rPr>
                     <w:sz w:val="14"/>
-                    <w:szCs w:val="14"/>
                   </w:rPr>
-                  <w:t xml:space="preserve">type here</w:t>
+                  <w:t xml:space="preserve">κ=human-hours/H0 + annual energy cost ratio + 0.05 spares/battery + 0.03 consumables. Electrical estimate: positive simulated work/assumed 0.60 efficiency + 20 W modelled blower + 5 W electronics; two assumed 3 W cameras. Tariff ratio=0.0003 per kWh of one-year baseline cost.</w:t>
                 </w:r>
               </w:sdtContent>
             </w:sdt>
@@ -5139,9 +5025,8 @@
                 <w:r>
                   <w:rPr>
                     <w:sz w:val="14"/>
-                    <w:szCs w:val="14"/>
                   </w:rPr>
-                  <w:t xml:space="preserve">type here</w:t>
+                  <w:t xml:space="preserve">κ=0.61935; NCRI=1−κ=0.38065. Estimated system energy 51.162 kWh/year under scenario assumptions; not measured electrical energy.</w:t>
                 </w:r>
               </w:sdtContent>
             </w:sdt>
@@ -5150,7 +5035,6 @@
       </w:tr>
       <w:tr>
         <w:trPr>
-          <w:trHeight w:val="567" w:hRule="atLeast"/>
           <w:cantSplit/>
         </w:trPr>
         <w:tc>
@@ -5219,9 +5103,8 @@
                 <w:r>
                   <w:rPr>
                     <w:sz w:val="14"/>
-                    <w:szCs w:val="14"/>
                   </w:rPr>
-                  <w:t xml:space="preserve">type here</w:t>
+                  <w:t xml:space="preserve">A section is one 24 m² bay, not a raster lane. λ=2.625 sections/h; μ=3600/[E(Tattempt)/p + (1−p)·180/p + 180]=4.55202 sections/h; c=1. Poisson arrivals/exponential service assumed.</w:t>
                 </w:r>
               </w:sdtContent>
             </w:sdt>
@@ -5251,9 +5134,8 @@
                 <w:r>
                   <w:rPr>
                     <w:sz w:val="14"/>
-                    <w:szCs w:val="14"/>
                   </w:rPr>
-                  <w:t xml:space="preserve">type here</w:t>
+                  <w:t xml:space="preserve">ρ=0.57667; Wq=17.955 min if stable. Mean service 790.858 s. M/M/1 distribution assumptions are not validated by the simulator.</w:t>
                 </w:r>
               </w:sdtContent>
             </w:sdt>
@@ -5262,7 +5144,6 @@
       </w:tr>
       <w:tr>
         <w:trPr>
-          <w:trHeight w:val="567" w:hRule="atLeast"/>
           <w:cantSplit/>
         </w:trPr>
         <w:tc>
@@ -5328,9 +5209,8 @@
                 <w:r>
                   <w:rPr>
                     <w:sz w:val="14"/>
-                    <w:szCs w:val="14"/>
                   </w:rPr>
-                  <w:t xml:space="preserve">type here</w:t>
+                  <w:t xml:space="preserve">Eight inputs swept ±30%: supervision, baseline hours, CapEx, manual transfer, failure recovery, energy price ratio, maintenance and drive efficiency. Repeated independent retries are an assumption. See sensitivity.csv; no PV yield uplift is monetised.</w:t>
                 </w:r>
               </w:sdtContent>
             </w:sdt>
@@ -5359,9 +5239,8 @@
                 <w:r>
                   <w:rPr>
                     <w:sz w:val="14"/>
-                    <w:szCs w:val="14"/>
                   </w:rPr>
-                  <w:t xml:space="preserve">type here</w:t>
+                  <w:t xml:space="preserve">Break-even supervision fraction f=0.6273; maximum k for payback within assumed life=1.9033. Negative NCRI and unstable queues are retained, not converted to finite payback.</w:t>
                 </w:r>
               </w:sdtContent>
             </w:sdt>
@@ -5430,7 +5309,7 @@
                 </w:rPr>
                 <w:alias w:val="M06.S3.E058.queue_model"/>
                 <w:tag w:val="M06.S3.E058.queue_model"/>
-                <w:dropDownList>
+                <w:dropDownList w:lastValue="M/M/1">
                   <w:listItem w:displayText="Select ▾" w:value=""/>
                   <w:listItem w:displayText="M/M/1" w:value="M/M/1"/>
                   <w:listItem w:displayText="M/M/c" w:value="M/M/c"/>
@@ -5440,10 +5319,9 @@
               <w:sdtContent>
                 <w:r>
                   <w:rPr>
-                    <w:sz w:val="15"/>
-                    <w:szCs w:val="15"/>
+                    <w:sz w:val="14"/>
                   </w:rPr>
-                  <w:t xml:space="preserve">Select ▾</w:t>
+                  <w:t xml:space="preserve">M/M/1</w:t>
                 </w:r>
               </w:sdtContent>
             </w:sdt>
@@ -5499,10 +5377,9 @@
               <w:sdtContent>
                 <w:r>
                   <w:rPr>
-                    <w:sz w:val="15"/>
-                    <w:szCs w:val="15"/>
+                    <w:sz w:val="14"/>
                   </w:rPr>
-                  <w:t xml:space="preserve">type here</w:t>
+                  <w:t xml:space="preserve">λ=2.625 sections/h; μ=4.55202 sections/h; c=1; ρ=0.57667</w:t>
                 </w:r>
               </w:sdtContent>
             </w:sdt>
@@ -5558,10 +5435,9 @@
               <w:sdtContent>
                 <w:r>
                   <w:rPr>
-                    <w:sz w:val="15"/>
-                    <w:szCs w:val="15"/>
+                    <w:sz w:val="14"/>
                   </w:rPr>
-                  <w:t xml:space="preserve">type here</w:t>
+                  <w:t xml:space="preserve">20.4912 months; assumed scenario</w:t>
                 </w:r>
               </w:sdtContent>
             </w:sdt>
@@ -5610,7 +5486,7 @@
                 </w:rPr>
                 <w:alias w:val="M06.S3.E058.reproducible"/>
                 <w:tag w:val="M06.S3.E058.reproducible"/>
-                <w:dropDownList>
+                <w:dropDownList w:lastValue="Yes">
                   <w:listItem w:displayText="Select ▾" w:value=""/>
                   <w:listItem w:displayText="Yes" w:value="Yes"/>
                   <w:listItem w:displayText="No" w:value="No"/>
@@ -5619,10 +5495,9 @@
               <w:sdtContent>
                 <w:r>
                   <w:rPr>
-                    <w:sz w:val="15"/>
-                    <w:szCs w:val="15"/>
+                    <w:sz w:val="14"/>
                   </w:rPr>
-                  <w:t xml:space="preserve">Select ▾</w:t>
+                  <w:t xml:space="preserve">Yes</w:t>
                 </w:r>
               </w:sdtContent>
             </w:sdt>
@@ -5889,7 +5764,6 @@
       </w:tr>
       <w:tr>
         <w:trPr>
-          <w:trHeight w:val="510" w:hRule="atLeast"/>
           <w:cantSplit/>
         </w:trPr>
         <w:tc>
@@ -5937,9 +5811,8 @@
                 <w:r>
                   <w:rPr>
                     <w:sz w:val="14"/>
-                    <w:szCs w:val="14"/>
                   </w:rPr>
-                  <w:t xml:space="preserve">type here</w:t>
+                  <w:t xml:space="preserve">Fall/damage, interrupted work and human recovery.</w:t>
                 </w:r>
               </w:sdtContent>
             </w:sdt>
@@ -5963,7 +5836,7 @@
                 </w:rPr>
                 <w:alias w:val="M06.S3.fmea1.severity"/>
                 <w:tag w:val="M06.S3.fmea1.severity"/>
-                <w:dropDownList>
+                <w:dropDownList w:lastValue="9">
                   <w:listItem w:displayText="Select ▾" w:value=""/>
                   <w:listItem w:displayText="1" w:value="1"/>
                   <w:listItem w:displayText="2" w:value="2"/>
@@ -5981,9 +5854,8 @@
                 <w:r>
                   <w:rPr>
                     <w:sz w:val="14"/>
-                    <w:szCs w:val="14"/>
                   </w:rPr>
-                  <w:t xml:space="preserve">Select ▾</w:t>
+                  <w:t xml:space="preserve">9</w:t>
                 </w:r>
               </w:sdtContent>
             </w:sdt>
@@ -6007,7 +5879,7 @@
                 </w:rPr>
                 <w:alias w:val="M06.S3.fmea1.occurrence"/>
                 <w:tag w:val="M06.S3.fmea1.occurrence"/>
-                <w:dropDownList>
+                <w:dropDownList w:lastValue="4">
                   <w:listItem w:displayText="Select ▾" w:value=""/>
                   <w:listItem w:displayText="1" w:value="1"/>
                   <w:listItem w:displayText="2" w:value="2"/>
@@ -6025,9 +5897,8 @@
                 <w:r>
                   <w:rPr>
                     <w:sz w:val="14"/>
-                    <w:szCs w:val="14"/>
                   </w:rPr>
-                  <w:t xml:space="preserve">Select ▾</w:t>
+                  <w:t xml:space="preserve">4</w:t>
                 </w:r>
               </w:sdtContent>
             </w:sdt>
@@ -6051,7 +5922,7 @@
                 </w:rPr>
                 <w:alias w:val="M06.S3.fmea1.detection"/>
                 <w:tag w:val="M06.S3.fmea1.detection"/>
-                <w:dropDownList>
+                <w:dropDownList w:lastValue="8">
                   <w:listItem w:displayText="Select ▾" w:value=""/>
                   <w:listItem w:displayText="1" w:value="1"/>
                   <w:listItem w:displayText="2" w:value="2"/>
@@ -6069,9 +5940,8 @@
                 <w:r>
                   <w:rPr>
                     <w:sz w:val="14"/>
-                    <w:szCs w:val="14"/>
                   </w:rPr>
-                  <w:t xml:space="preserve">Select ▾</w:t>
+                  <w:t xml:space="preserve">8</w:t>
                 </w:r>
               </w:sdtContent>
             </w:sdt>
@@ -6101,9 +5971,8 @@
                 <w:r>
                   <w:rPr>
                     <w:sz w:val="14"/>
-                    <w:szCs w:val="14"/>
                   </w:rPr>
-                  <w:t xml:space="preserve">type here</w:t>
+                  <w:t xml:space="preserve">288</w:t>
                 </w:r>
               </w:sdtContent>
             </w:sdt>
@@ -6133,9 +6002,8 @@
                 <w:r>
                   <w:rPr>
                     <w:sz w:val="14"/>
-                    <w:szCs w:val="14"/>
                   </w:rPr>
-                  <w:t xml:space="preserve">type here</w:t>
+                  <w:t xml:space="preserve">Physical containment guard, bounded return drive, attitude/height stop and logged guard load; guards remain part of the safety model. Post D=3 credits simulation fault detection only.</w:t>
                 </w:r>
               </w:sdtContent>
             </w:sdt>
@@ -6165,9 +6033,8 @@
                 <w:r>
                   <w:rPr>
                     <w:sz w:val="14"/>
-                    <w:szCs w:val="14"/>
                   </w:rPr>
-                  <w:t xml:space="preserve">type here</w:t>
+                  <w:t xml:space="preserve">108</w:t>
                 </w:r>
               </w:sdtContent>
             </w:sdt>
@@ -6191,7 +6058,7 @@
                 </w:rPr>
                 <w:alias w:val="M06.S3.fmea1.evidence"/>
                 <w:tag w:val="M06.S3.fmea1.evidence"/>
-                <w:dropDownList>
+                <w:dropDownList w:lastValue="Both">
                   <w:listItem w:displayText="Select ▾" w:value=""/>
                   <w:listItem w:displayText="Simulation" w:value="Simulation"/>
                   <w:listItem w:displayText="Code" w:value="Code"/>
@@ -6203,9 +6070,8 @@
                 <w:r>
                   <w:rPr>
                     <w:sz w:val="14"/>
-                    <w:szCs w:val="14"/>
                   </w:rPr>
-                  <w:t xml:space="preserve">Select ▾</w:t>
+                  <w:t xml:space="preserve">Both</w:t>
                 </w:r>
               </w:sdtContent>
             </w:sdt>
@@ -6214,7 +6080,6 @@
       </w:tr>
       <w:tr>
         <w:trPr>
-          <w:trHeight w:val="510" w:hRule="atLeast"/>
           <w:cantSplit/>
         </w:trPr>
         <w:tc>
@@ -6262,9 +6127,8 @@
                 <w:r>
                   <w:rPr>
                     <w:sz w:val="14"/>
-                    <w:szCs w:val="14"/>
                   </w:rPr>
-                  <w:t xml:space="preserve">type here</w:t>
+                  <w:t xml:space="preserve">Permanent PV damage and repair cost.</w:t>
                 </w:r>
               </w:sdtContent>
             </w:sdt>
@@ -6288,7 +6152,7 @@
                 </w:rPr>
                 <w:alias w:val="M06.S3.fmea2.severity"/>
                 <w:tag w:val="M06.S3.fmea2.severity"/>
-                <w:dropDownList>
+                <w:dropDownList w:lastValue="8">
                   <w:listItem w:displayText="Select ▾" w:value=""/>
                   <w:listItem w:displayText="1" w:value="1"/>
                   <w:listItem w:displayText="2" w:value="2"/>
@@ -6306,9 +6170,8 @@
                 <w:r>
                   <w:rPr>
                     <w:sz w:val="14"/>
-                    <w:szCs w:val="14"/>
                   </w:rPr>
-                  <w:t xml:space="preserve">Select ▾</w:t>
+                  <w:t xml:space="preserve">8</w:t>
                 </w:r>
               </w:sdtContent>
             </w:sdt>
@@ -6332,7 +6195,7 @@
                 </w:rPr>
                 <w:alias w:val="M06.S3.fmea2.occurrence"/>
                 <w:tag w:val="M06.S3.fmea2.occurrence"/>
-                <w:dropDownList>
+                <w:dropDownList w:lastValue="4">
                   <w:listItem w:displayText="Select ▾" w:value=""/>
                   <w:listItem w:displayText="1" w:value="1"/>
                   <w:listItem w:displayText="2" w:value="2"/>
@@ -6350,9 +6213,8 @@
                 <w:r>
                   <w:rPr>
                     <w:sz w:val="14"/>
-                    <w:szCs w:val="14"/>
                   </w:rPr>
-                  <w:t xml:space="preserve">Select ▾</w:t>
+                  <w:t xml:space="preserve">4</w:t>
                 </w:r>
               </w:sdtContent>
             </w:sdt>
@@ -6376,7 +6238,7 @@
                 </w:rPr>
                 <w:alias w:val="M06.S3.fmea2.detection"/>
                 <w:tag w:val="M06.S3.fmea2.detection"/>
-                <w:dropDownList>
+                <w:dropDownList w:lastValue="9">
                   <w:listItem w:displayText="Select ▾" w:value=""/>
                   <w:listItem w:displayText="1" w:value="1"/>
                   <w:listItem w:displayText="2" w:value="2"/>
@@ -6394,9 +6256,8 @@
                 <w:r>
                   <w:rPr>
                     <w:sz w:val="14"/>
-                    <w:szCs w:val="14"/>
                   </w:rPr>
-                  <w:t xml:space="preserve">Select ▾</w:t>
+                  <w:t xml:space="preserve">9</w:t>
                 </w:r>
               </w:sdtContent>
             </w:sdt>
@@ -6426,9 +6287,8 @@
                 <w:r>
                   <w:rPr>
                     <w:sz w:val="14"/>
-                    <w:szCs w:val="14"/>
                   </w:rPr>
-                  <w:t xml:space="preserve">type here</w:t>
+                  <w:t xml:space="preserve">288</w:t>
                 </w:r>
               </w:sdtContent>
             </w:sdt>
@@ -6458,9 +6318,8 @@
                 <w:r>
                   <w:rPr>
                     <w:sz w:val="14"/>
-                    <w:szCs w:val="14"/>
                   </w:rPr>
-                  <w:t xml:space="preserve">type here</w:t>
+                  <w:t xml:space="preserve">Rounded soft-contact brush and load logs support development. Coating wear, grit hardness and allowable local pressure are unvalidated. No reduction credited: post S/O/D unchanged.</w:t>
                 </w:r>
               </w:sdtContent>
             </w:sdt>
@@ -6490,9 +6349,8 @@
                 <w:r>
                   <w:rPr>
                     <w:sz w:val="14"/>
-                    <w:szCs w:val="14"/>
                   </w:rPr>
-                  <w:t xml:space="preserve">type here</w:t>
+                  <w:t xml:space="preserve">288</w:t>
                 </w:r>
               </w:sdtContent>
             </w:sdt>
@@ -6516,7 +6374,7 @@
                 </w:rPr>
                 <w:alias w:val="M06.S3.fmea2.evidence"/>
                 <w:tag w:val="M06.S3.fmea2.evidence"/>
-                <w:dropDownList>
+                <w:dropDownList w:lastValue="Not yet">
                   <w:listItem w:displayText="Select ▾" w:value=""/>
                   <w:listItem w:displayText="Simulation" w:value="Simulation"/>
                   <w:listItem w:displayText="Code" w:value="Code"/>
@@ -6528,9 +6386,8 @@
                 <w:r>
                   <w:rPr>
                     <w:sz w:val="14"/>
-                    <w:szCs w:val="14"/>
                   </w:rPr>
-                  <w:t xml:space="preserve">Select ▾</w:t>
+                  <w:t xml:space="preserve">Not yet</w:t>
                 </w:r>
               </w:sdtContent>
             </w:sdt>
@@ -6539,7 +6396,6 @@
       </w:tr>
       <w:tr>
         <w:trPr>
-          <w:trHeight w:val="510" w:hRule="atLeast"/>
           <w:cantSplit/>
         </w:trPr>
         <w:tc>
@@ -6566,9 +6422,8 @@
                 <w:r>
                   <w:rPr>
                     <w:sz w:val="14"/>
-                    <w:szCs w:val="14"/>
                   </w:rPr>
-                  <w:t xml:space="preserve">type here</w:t>
+                  <w:t xml:space="preserve">RGB misses dirt or falsely declares clean</w:t>
                 </w:r>
               </w:sdtContent>
             </w:sdt>
@@ -6598,9 +6453,8 @@
                 <w:r>
                   <w:rPr>
                     <w:sz w:val="14"/>
-                    <w:szCs w:val="14"/>
                   </w:rPr>
-                  <w:t xml:space="preserve">type here</w:t>
+                  <w:t xml:space="preserve">Residual dirt or wasted cleaning cycle.</w:t>
                 </w:r>
               </w:sdtContent>
             </w:sdt>
@@ -6624,7 +6478,7 @@
                 </w:rPr>
                 <w:alias w:val="M06.S3.fmea3.severity"/>
                 <w:tag w:val="M06.S3.fmea3.severity"/>
-                <w:dropDownList>
+                <w:dropDownList w:lastValue="6">
                   <w:listItem w:displayText="Select ▾" w:value=""/>
                   <w:listItem w:displayText="1" w:value="1"/>
                   <w:listItem w:displayText="2" w:value="2"/>
@@ -6642,9 +6496,8 @@
                 <w:r>
                   <w:rPr>
                     <w:sz w:val="14"/>
-                    <w:szCs w:val="14"/>
                   </w:rPr>
-                  <w:t xml:space="preserve">Select ▾</w:t>
+                  <w:t xml:space="preserve">6</w:t>
                 </w:r>
               </w:sdtContent>
             </w:sdt>
@@ -6668,7 +6521,7 @@
                 </w:rPr>
                 <w:alias w:val="M06.S3.fmea3.occurrence"/>
                 <w:tag w:val="M06.S3.fmea3.occurrence"/>
-                <w:dropDownList>
+                <w:dropDownList w:lastValue="5">
                   <w:listItem w:displayText="Select ▾" w:value=""/>
                   <w:listItem w:displayText="1" w:value="1"/>
                   <w:listItem w:displayText="2" w:value="2"/>
@@ -6686,9 +6539,8 @@
                 <w:r>
                   <w:rPr>
                     <w:sz w:val="14"/>
-                    <w:szCs w:val="14"/>
                   </w:rPr>
-                  <w:t xml:space="preserve">Select ▾</w:t>
+                  <w:t xml:space="preserve">5</w:t>
                 </w:r>
               </w:sdtContent>
             </w:sdt>
@@ -6712,7 +6564,7 @@
                 </w:rPr>
                 <w:alias w:val="M06.S3.fmea3.detection"/>
                 <w:tag w:val="M06.S3.fmea3.detection"/>
-                <w:dropDownList>
+                <w:dropDownList w:lastValue="8">
                   <w:listItem w:displayText="Select ▾" w:value=""/>
                   <w:listItem w:displayText="1" w:value="1"/>
                   <w:listItem w:displayText="2" w:value="2"/>
@@ -6730,9 +6582,8 @@
                 <w:r>
                   <w:rPr>
                     <w:sz w:val="14"/>
-                    <w:szCs w:val="14"/>
                   </w:rPr>
-                  <w:t xml:space="preserve">Select ▾</w:t>
+                  <w:t xml:space="preserve">8</w:t>
                 </w:r>
               </w:sdtContent>
             </w:sdt>
@@ -6762,9 +6613,8 @@
                 <w:r>
                   <w:rPr>
                     <w:sz w:val="14"/>
-                    <w:szCs w:val="14"/>
                   </w:rPr>
-                  <w:t xml:space="preserve">type here</w:t>
+                  <w:t xml:space="preserve">240</w:t>
                 </w:r>
               </w:sdtContent>
             </w:sdt>
@@ -6794,9 +6644,8 @@
                 <w:r>
                   <w:rPr>
                     <w:sz w:val="14"/>
-                    <w:szCs w:val="14"/>
                   </w:rPr>
-                  <w:t xml:space="preserve">type here</w:t>
+                  <w:t xml:space="preserve">Persistent two-frame image trigger; actual camera feeds; independent final residual check rejects false-clean development cases. Post D=3 is offline evaluation detectability, not field camera reliability.</w:t>
                 </w:r>
               </w:sdtContent>
             </w:sdt>
@@ -6826,9 +6675,8 @@
                 <w:r>
                   <w:rPr>
                     <w:sz w:val="14"/>
-                    <w:szCs w:val="14"/>
                   </w:rPr>
-                  <w:t xml:space="preserve">type here</w:t>
+                  <w:t xml:space="preserve">90</w:t>
                 </w:r>
               </w:sdtContent>
             </w:sdt>
@@ -6852,7 +6700,7 @@
                 </w:rPr>
                 <w:alias w:val="M06.S3.fmea3.evidence"/>
                 <w:tag w:val="M06.S3.fmea3.evidence"/>
-                <w:dropDownList>
+                <w:dropDownList w:lastValue="Both">
                   <w:listItem w:displayText="Select ▾" w:value=""/>
                   <w:listItem w:displayText="Simulation" w:value="Simulation"/>
                   <w:listItem w:displayText="Code" w:value="Code"/>
@@ -6864,9 +6712,8 @@
                 <w:r>
                   <w:rPr>
                     <w:sz w:val="14"/>
-                    <w:szCs w:val="14"/>
                   </w:rPr>
-                  <w:t xml:space="preserve">Select ▾</w:t>
+                  <w:t xml:space="preserve">Both</w:t>
                 </w:r>
               </w:sdtContent>
             </w:sdt>
@@ -6875,7 +6722,6 @@
       </w:tr>
       <w:tr>
         <w:trPr>
-          <w:trHeight w:val="510" w:hRule="atLeast"/>
           <w:cantSplit/>
         </w:trPr>
         <w:tc>
@@ -6902,9 +6748,8 @@
                 <w:r>
                   <w:rPr>
                     <w:sz w:val="14"/>
-                    <w:szCs w:val="14"/>
                   </w:rPr>
-                  <w:t xml:space="preserve">type here</w:t>
+                  <w:t xml:space="preserve">Large solid escapes or jams the guide</w:t>
                 </w:r>
               </w:sdtContent>
             </w:sdt>
@@ -6934,9 +6779,8 @@
                 <w:r>
                   <w:rPr>
                     <w:sz w:val="14"/>
-                    <w:szCs w:val="14"/>
                   </w:rPr>
-                  <w:t xml:space="preserve">type here</w:t>
+                  <w:t xml:space="preserve">Unsafe ejection, jam or incomplete mission.</w:t>
                 </w:r>
               </w:sdtContent>
             </w:sdt>
@@ -6960,7 +6804,7 @@
                 </w:rPr>
                 <w:alias w:val="M06.S3.fmea4.severity"/>
                 <w:tag w:val="M06.S3.fmea4.severity"/>
-                <w:dropDownList>
+                <w:dropDownList w:lastValue="7">
                   <w:listItem w:displayText="Select ▾" w:value=""/>
                   <w:listItem w:displayText="1" w:value="1"/>
                   <w:listItem w:displayText="2" w:value="2"/>
@@ -6978,9 +6822,8 @@
                 <w:r>
                   <w:rPr>
                     <w:sz w:val="14"/>
-                    <w:szCs w:val="14"/>
                   </w:rPr>
-                  <w:t xml:space="preserve">Select ▾</w:t>
+                  <w:t xml:space="preserve">7</w:t>
                 </w:r>
               </w:sdtContent>
             </w:sdt>
@@ -7004,7 +6847,7 @@
                 </w:rPr>
                 <w:alias w:val="M06.S3.fmea4.occurrence"/>
                 <w:tag w:val="M06.S3.fmea4.occurrence"/>
-                <w:dropDownList>
+                <w:dropDownList w:lastValue="4">
                   <w:listItem w:displayText="Select ▾" w:value=""/>
                   <w:listItem w:displayText="1" w:value="1"/>
                   <w:listItem w:displayText="2" w:value="2"/>
@@ -7022,9 +6865,8 @@
                 <w:r>
                   <w:rPr>
                     <w:sz w:val="14"/>
-                    <w:szCs w:val="14"/>
                   </w:rPr>
-                  <w:t xml:space="preserve">Select ▾</w:t>
+                  <w:t xml:space="preserve">4</w:t>
                 </w:r>
               </w:sdtContent>
             </w:sdt>
@@ -7048,7 +6890,7 @@
                 </w:rPr>
                 <w:alias w:val="M06.S3.fmea4.detection"/>
                 <w:tag w:val="M06.S3.fmea4.detection"/>
-                <w:dropDownList>
+                <w:dropDownList w:lastValue="7">
                   <w:listItem w:displayText="Select ▾" w:value=""/>
                   <w:listItem w:displayText="1" w:value="1"/>
                   <w:listItem w:displayText="2" w:value="2"/>
@@ -7066,9 +6908,8 @@
                 <w:r>
                   <w:rPr>
                     <w:sz w:val="14"/>
-                    <w:szCs w:val="14"/>
                   </w:rPr>
-                  <w:t xml:space="preserve">Select ▾</w:t>
+                  <w:t xml:space="preserve">7</w:t>
                 </w:r>
               </w:sdtContent>
             </w:sdt>
@@ -7098,9 +6939,8 @@
                 <w:r>
                   <w:rPr>
                     <w:sz w:val="14"/>
-                    <w:szCs w:val="14"/>
                   </w:rPr>
-                  <w:t xml:space="preserve">type here</w:t>
+                  <w:t xml:space="preserve">196</w:t>
                 </w:r>
               </w:sdtContent>
             </w:sdt>
@@ -7130,9 +6970,8 @@
                 <w:r>
                   <w:rPr>
                     <w:sz w:val="14"/>
-                    <w:szCs w:val="14"/>
                   </w:rPr>
-                  <w:t xml:space="preserve">type here</w:t>
+                  <w:t xml:space="preserve">Permanent tray, fixed guide and actual solid/contact logs; success requires final retention. Applies only to the tested lower-strip corridor. Post D=3 credits final logged check.</w:t>
                 </w:r>
               </w:sdtContent>
             </w:sdt>
@@ -7162,9 +7001,8 @@
                 <w:r>
                   <w:rPr>
                     <w:sz w:val="14"/>
-                    <w:szCs w:val="14"/>
                   </w:rPr>
-                  <w:t xml:space="preserve">type here</w:t>
+                  <w:t xml:space="preserve">84</w:t>
                 </w:r>
               </w:sdtContent>
             </w:sdt>
@@ -7188,7 +7026,7 @@
                 </w:rPr>
                 <w:alias w:val="M06.S3.fmea4.evidence"/>
                 <w:tag w:val="M06.S3.fmea4.evidence"/>
-                <w:dropDownList>
+                <w:dropDownList w:lastValue="Both">
                   <w:listItem w:displayText="Select ▾" w:value=""/>
                   <w:listItem w:displayText="Simulation" w:value="Simulation"/>
                   <w:listItem w:displayText="Code" w:value="Code"/>
@@ -7200,9 +7038,8 @@
                 <w:r>
                   <w:rPr>
                     <w:sz w:val="14"/>
-                    <w:szCs w:val="14"/>
                   </w:rPr>
-                  <w:t xml:space="preserve">Select ▾</w:t>
+                  <w:t xml:space="preserve">Both</w:t>
                 </w:r>
               </w:sdtContent>
             </w:sdt>
@@ -7211,7 +7048,6 @@
       </w:tr>
       <w:tr>
         <w:trPr>
-          <w:trHeight w:val="510" w:hRule="atLeast"/>
           <w:cantSplit/>
         </w:trPr>
         <w:tc>
@@ -7237,9 +7073,8 @@
                 <w:r>
                   <w:rPr>
                     <w:sz w:val="14"/>
-                    <w:szCs w:val="14"/>
                   </w:rPr>
-                  <w:t xml:space="preserve">type here</w:t>
+                  <w:t xml:space="preserve">Dock transfer/accounting fault</w:t>
                 </w:r>
               </w:sdtContent>
             </w:sdt>
@@ -7268,9 +7103,8 @@
                 <w:r>
                   <w:rPr>
                     <w:sz w:val="14"/>
-                    <w:szCs w:val="14"/>
                   </w:rPr>
-                  <w:t xml:space="preserve">type here</w:t>
+                  <w:t xml:space="preserve">Dirt inventory error or missed service.</w:t>
                 </w:r>
               </w:sdtContent>
             </w:sdt>
@@ -7293,7 +7127,7 @@
                 </w:rPr>
                 <w:alias w:val="M06.S3.fmea5.severity"/>
                 <w:tag w:val="M06.S3.fmea5.severity"/>
-                <w:dropDownList>
+                <w:dropDownList w:lastValue="5">
                   <w:listItem w:displayText="Select ▾" w:value=""/>
                   <w:listItem w:displayText="1" w:value="1"/>
                   <w:listItem w:displayText="2" w:value="2"/>
@@ -7311,9 +7145,8 @@
                 <w:r>
                   <w:rPr>
                     <w:sz w:val="14"/>
-                    <w:szCs w:val="14"/>
                   </w:rPr>
-                  <w:t xml:space="preserve">Select ▾</w:t>
+                  <w:t xml:space="preserve">5</w:t>
                 </w:r>
               </w:sdtContent>
             </w:sdt>
@@ -7336,7 +7169,7 @@
                 </w:rPr>
                 <w:alias w:val="M06.S3.fmea5.occurrence"/>
                 <w:tag w:val="M06.S3.fmea5.occurrence"/>
-                <w:dropDownList>
+                <w:dropDownList w:lastValue="4">
                   <w:listItem w:displayText="Select ▾" w:value=""/>
                   <w:listItem w:displayText="1" w:value="1"/>
                   <w:listItem w:displayText="2" w:value="2"/>
@@ -7354,9 +7187,8 @@
                 <w:r>
                   <w:rPr>
                     <w:sz w:val="14"/>
-                    <w:szCs w:val="14"/>
                   </w:rPr>
-                  <w:t xml:space="preserve">Select ▾</w:t>
+                  <w:t xml:space="preserve">4</w:t>
                 </w:r>
               </w:sdtContent>
             </w:sdt>
@@ -7379,7 +7211,7 @@
                 </w:rPr>
                 <w:alias w:val="M06.S3.fmea5.detection"/>
                 <w:tag w:val="M06.S3.fmea5.detection"/>
-                <w:dropDownList>
+                <w:dropDownList w:lastValue="7">
                   <w:listItem w:displayText="Select ▾" w:value=""/>
                   <w:listItem w:displayText="1" w:value="1"/>
                   <w:listItem w:displayText="2" w:value="2"/>
@@ -7397,9 +7229,8 @@
                 <w:r>
                   <w:rPr>
                     <w:sz w:val="14"/>
-                    <w:szCs w:val="14"/>
                   </w:rPr>
-                  <w:t xml:space="preserve">Select ▾</w:t>
+                  <w:t xml:space="preserve">7</w:t>
                 </w:r>
               </w:sdtContent>
             </w:sdt>
@@ -7428,9 +7259,8 @@
                 <w:r>
                   <w:rPr>
                     <w:sz w:val="14"/>
-                    <w:szCs w:val="14"/>
                   </w:rPr>
-                  <w:t xml:space="preserve">type here</w:t>
+                  <w:t xml:space="preserve">140</w:t>
                 </w:r>
               </w:sdtContent>
             </w:sdt>
@@ -7459,9 +7289,8 @@
                 <w:r>
                   <w:rPr>
                     <w:sz w:val="14"/>
-                    <w:szCs w:val="14"/>
                   </w:rPr>
-                  <w:t xml:space="preserve">type here</w:t>
+                  <w:t xml:space="preserve">Settled docking, 8 s modelled service, explicit mass balance and charge-energy counters. Post D=3 credits software checks; no airflow, connector or battery hardware reliability claim.</w:t>
                 </w:r>
               </w:sdtContent>
             </w:sdt>
@@ -7490,9 +7319,8 @@
                 <w:r>
                   <w:rPr>
                     <w:sz w:val="14"/>
-                    <w:szCs w:val="14"/>
                   </w:rPr>
-                  <w:t xml:space="preserve">type here</w:t>
+                  <w:t xml:space="preserve">60</w:t>
                 </w:r>
               </w:sdtContent>
             </w:sdt>
@@ -7515,7 +7343,7 @@
                 </w:rPr>
                 <w:alias w:val="M06.S3.fmea5.evidence"/>
                 <w:tag w:val="M06.S3.fmea5.evidence"/>
-                <w:dropDownList>
+                <w:dropDownList w:lastValue="Both">
                   <w:listItem w:displayText="Select ▾" w:value=""/>
                   <w:listItem w:displayText="Simulation" w:value="Simulation"/>
                   <w:listItem w:displayText="Code" w:value="Code"/>
@@ -7527,9 +7355,8 @@
                 <w:r>
                   <w:rPr>
                     <w:sz w:val="14"/>
-                    <w:szCs w:val="14"/>
                   </w:rPr>
-                  <w:t xml:space="preserve">Select ▾</w:t>
+                  <w:t xml:space="preserve">Both</w:t>
                 </w:r>
               </w:sdtContent>
             </w:sdt>
@@ -7556,7 +7383,6 @@
       </w:tblGrid>
       <w:tr>
         <w:trPr>
-          <w:trHeight w:val="2608" w:hRule="exact"/>
           <w:cantSplit/>
         </w:trPr>
         <w:tc>
@@ -7565,19 +7391,48 @@
             <w:shd w:val="clear" w:color="auto" w:fill="F2F2F2"/>
           </w:tcPr>
           <w:p>
-            <w:pPr>
-              <w:spacing w:after="0"/>
-              <w:jc w:val="center"/>
-            </w:pPr>
-            <w:r/>
+            <w:r/>
+            <w:r>
+              <w:drawing>
+                <wp:inline xmlns:a="http://schemas.openxmlformats.org/drawingml/2006/main" xmlns:pic="http://schemas.openxmlformats.org/drawingml/2006/picture">
+                  <wp:extent cx="2880360" cy="1097280"/>
+                  <wp:docPr id="2" name="Picture 2"/>
+                  <wp:cNvGraphicFramePr>
+                    <a:graphicFrameLocks noChangeAspect="1"/>
+                  </wp:cNvGraphicFramePr>
+                  <a:graphic>
+                    <a:graphicData uri="http://schemas.openxmlformats.org/drawingml/2006/picture">
+                      <pic:pic>
+                        <pic:nvPicPr>
+                          <pic:cNvPr id="0" name="business_sensitivity.png"/>
+                          <pic:cNvPicPr/>
+                        </pic:nvPicPr>
+                        <pic:blipFill>
+                          <a:blip r:embed="rId11"/>
+                          <a:stretch>
+                            <a:fillRect/>
+                          </a:stretch>
+                        </pic:blipFill>
+                        <pic:spPr>
+                          <a:xfrm>
+                            <a:off x="0" y="0"/>
+                            <a:ext cx="2880360" cy="1097280"/>
+                          </a:xfrm>
+                          <a:prstGeom prst="rect"/>
+                        </pic:spPr>
+                      </pic:pic>
+                    </a:graphicData>
+                  </a:graphic>
+                </wp:inline>
+              </w:drawing>
+            </w:r>
+          </w:p>
+          <w:p>
             <w:r>
               <w:rPr>
-                <w:b w:val="0"/>
-                <w:i/>
-                <w:color w:val="595959"/>
-                <w:sz w:val="15"/>
+                <w:sz w:val="14"/>
               </w:rPr>
-              <w:t>[ Sensitivity graph: P_payback / NCRI vs the uncertain input ]</w:t>
+              <w:t>Dimensionless commercial assumptions; no observed cost-saving claim.</w:t>
             </w:r>
           </w:p>
         </w:tc>
@@ -7587,19 +7442,48 @@
             <w:shd w:val="clear" w:color="auto" w:fill="F2F2F2"/>
           </w:tcPr>
           <w:p>
-            <w:pPr>
-              <w:spacing w:after="0"/>
-              <w:jc w:val="center"/>
-            </w:pPr>
-            <w:r/>
+            <w:r/>
+            <w:r>
+              <w:drawing>
+                <wp:inline xmlns:a="http://schemas.openxmlformats.org/drawingml/2006/main" xmlns:pic="http://schemas.openxmlformats.org/drawingml/2006/picture">
+                  <wp:extent cx="2880360" cy="1097280"/>
+                  <wp:docPr id="3" name="Picture 3"/>
+                  <wp:cNvGraphicFramePr>
+                    <a:graphicFrameLocks noChangeAspect="1"/>
+                  </wp:cNvGraphicFramePr>
+                  <a:graphic>
+                    <a:graphicData uri="http://schemas.openxmlformats.org/drawingml/2006/picture">
+                      <pic:pic>
+                        <pic:nvPicPr>
+                          <pic:cNvPr id="0" name="queue_and_labour.png"/>
+                          <pic:cNvPicPr/>
+                        </pic:nvPicPr>
+                        <pic:blipFill>
+                          <a:blip r:embed="rId12"/>
+                          <a:stretch>
+                            <a:fillRect/>
+                          </a:stretch>
+                        </pic:blipFill>
+                        <pic:spPr>
+                          <a:xfrm>
+                            <a:off x="0" y="0"/>
+                            <a:ext cx="2880360" cy="1097280"/>
+                          </a:xfrm>
+                          <a:prstGeom prst="rect"/>
+                        </pic:spPr>
+                      </pic:pic>
+                    </a:graphicData>
+                  </a:graphic>
+                </wp:inline>
+              </w:drawing>
+            </w:r>
+          </w:p>
+          <w:p>
             <w:r>
               <w:rPr>
-                <w:b w:val="0"/>
-                <w:i/>
-                <w:color w:val="595959"/>
-                <w:sz w:val="15"/>
+                <w:sz w:val="14"/>
               </w:rPr>
-              <w:t>[ Queuing graph: W_q vs utilisation ρ, or labour-reallocation chart ]</w:t>
+              <w:t>Queue distribution assumed; transfer and maintenance count as human labour.</w:t>
             </w:r>
           </w:p>
         </w:tc>
@@ -7680,19 +7564,8 @@
             <w:tcW w:type="dxa" w:w="7597"/>
           </w:tcPr>
           <w:p>
-            <w:pPr>
-              <w:keepNext/>
-              <w:spacing w:after="0"/>
-            </w:pPr>
-            <w:r/>
             <w:r>
-              <w:rPr>
-                <w:b w:val="0"/>
-                <w:i w:val="0"/>
-                <w:color w:val="000000"/>
-                <w:sz w:val="14"/>
-              </w:rPr>
-              <w:t>Test cleaning coverage across N = 20 simulated runs at tilt angles from 10 to 30 degrees. Measure: crawler slip distance (mm), cleaning time per panel (s), power consumption of the cleaning rig (Wh/m^2), and restored power output yield (%).</w:t>
+              <w:t>Revised evaluation: N=30/controller/tilt at 10°,20°,30° (180 full attempts), initial pose/soil-layout variation, complete-cycle success, footprint, motion/load, simulated mechanical work. Primary controller comparison: common first-30-second tracking RMSE. PV electrical restoration and measured electrical Wh/m² are not available.</w:t>
             </w:r>
           </w:p>
         </w:tc>
@@ -8050,10 +7923,9 @@
               <w:sdtContent>
                 <w:r>
                   <w:rPr>
-                    <w:sz w:val="15"/>
-                    <w:szCs w:val="15"/>
+                    <w:sz w:val="14"/>
                   </w:rPr>
-                  <w:t xml:space="preserve">type here</w:t>
+                  <w:t xml:space="preserve">PRELIMINARY: historical 30 s initial-sweep study on the earlier model, baseline waypoint/P vs proposed lookahead/PI. This is not a final collection-system study. A separate frozen 180 full-mission batch is running; do not merge datasets.</w:t>
                 </w:r>
               </w:sdtContent>
             </w:sdt>
@@ -8109,10 +7981,9 @@
               <w:sdtContent>
                 <w:r>
                   <w:rPr>
-                    <w:sz w:val="15"/>
-                    <w:szCs w:val="15"/>
+                    <w:sz w:val="14"/>
                   </w:rPr>
-                  <w:t xml:space="preserve">type here</w:t>
+                  <w:t xml:space="preserve">Historical study: 30 baseline + 30 proposed at nominal 20°. Final model: planned 30/controller/tilt × 10°,20°,30° = 180; pending.</w:t>
                 </w:r>
               </w:sdtContent>
             </w:sdt>
@@ -8168,10 +8039,9 @@
               <w:sdtContent>
                 <w:r>
                   <w:rPr>
-                    <w:sz w:val="15"/>
-                    <w:szCs w:val="15"/>
+                    <w:sz w:val="14"/>
                   </w:rPr>
-                  <w:t xml:space="preserve">type here</w:t>
+                  <w:t xml:space="preserve">Historical protocol records independent initial-pose seeds. Final protocol: initial x/y U(−0.01,+0.01) m and independent dust shape/offset seed; dry friction fixed. No wet-glass/random-colour challenge is claimed.</w:t>
                 </w:r>
               </w:sdtContent>
             </w:sdt>
@@ -8227,10 +8097,9 @@
               <w:sdtContent>
                 <w:r>
                   <w:rPr>
-                    <w:sz w:val="15"/>
-                    <w:szCs w:val="15"/>
+                    <w:sz w:val="14"/>
                   </w:rPr>
-                  <w:t xml:space="preserve">type here</w:t>
+                  <w:t xml:space="preserve">500 Hz; each 0.002 s integration sample. XZ compresses CSV; final batch serialises numbers to 9 significant digits.</w:t>
                 </w:r>
               </w:sdtContent>
             </w:sdt>
@@ -8281,7 +8150,7 @@
                 </w:rPr>
                 <w:alias w:val="M06.S4.seeds_recorded"/>
                 <w:tag w:val="M06.S4.seeds_recorded"/>
-                <w:dropDownList>
+                <w:dropDownList w:lastValue="Yes">
                   <w:listItem w:displayText="Select ▾" w:value=""/>
                   <w:listItem w:displayText="Yes" w:value="Yes"/>
                   <w:listItem w:displayText="No" w:value="No"/>
@@ -8290,10 +8159,9 @@
               <w:sdtContent>
                 <w:r>
                   <w:rPr>
-                    <w:sz w:val="15"/>
-                    <w:szCs w:val="15"/>
+                    <w:sz w:val="14"/>
                   </w:rPr>
-                  <w:t xml:space="preserve">Select ▾</w:t>
+                  <w:t xml:space="preserve">Yes</w:t>
                 </w:r>
               </w:sdtContent>
             </w:sdt>
@@ -8347,10 +8215,9 @@
               <w:sdtContent>
                 <w:r>
                   <w:rPr>
-                    <w:sz w:val="15"/>
-                    <w:szCs w:val="15"/>
+                    <w:sz w:val="14"/>
                   </w:rPr>
-                  <w:t xml:space="preserve">type here</w:t>
+                  <w:t xml:space="preserve">Historical: analytics/tracking_benchmark/*_real_trials.csv (see protocol.json). Pending final: analytics/final_validation_v1/tilt_*/{variant}_{seed}/telemetry.csv.xz.</w:t>
                 </w:r>
               </w:sdtContent>
             </w:sdt>
@@ -8564,10 +8431,9 @@
               <w:sdtContent>
                 <w:r>
                   <w:rPr>
-                    <w:sz w:val="15"/>
-                    <w:szCs w:val="15"/>
+                    <w:sz w:val="14"/>
                   </w:rPr>
-                  <w:t xml:space="preserve">type here</w:t>
+                  <w:t xml:space="preserve">30 per controller; historical only</w:t>
                 </w:r>
               </w:sdtContent>
             </w:sdt>
@@ -8596,10 +8462,9 @@
               <w:sdtContent>
                 <w:r>
                   <w:rPr>
-                    <w:sz w:val="15"/>
-                    <w:szCs w:val="15"/>
+                    <w:sz w:val="14"/>
                   </w:rPr>
-                  <w:t xml:space="preserve">type here</w:t>
+                  <w:t xml:space="preserve">0.1168456 ± 0.0010838</w:t>
                 </w:r>
               </w:sdtContent>
             </w:sdt>
@@ -8628,10 +8493,9 @@
               <w:sdtContent>
                 <w:r>
                   <w:rPr>
-                    <w:sz w:val="15"/>
-                    <w:szCs w:val="15"/>
+                    <w:sz w:val="14"/>
                   </w:rPr>
-                  <w:t xml:space="preserve">type here</w:t>
+                  <w:t xml:space="preserve">0.0227479 ± 0.0004936</w:t>
                 </w:r>
               </w:sdtContent>
             </w:sdt>
@@ -8660,10 +8524,9 @@
               <w:sdtContent>
                 <w:r>
                   <w:rPr>
-                    <w:sz w:val="15"/>
-                    <w:szCs w:val="15"/>
+                    <w:sz w:val="14"/>
                   </w:rPr>
-                  <w:t xml:space="preserve">type here</w:t>
+                  <w:t xml:space="preserve">m; 0–30 s geometric error</w:t>
                 </w:r>
               </w:sdtContent>
             </w:sdt>
@@ -8687,7 +8550,7 @@
                 </w:rPr>
                 <w:alias w:val="M06.S4.rmse.better"/>
                 <w:tag w:val="M06.S4.rmse.better"/>
-                <w:dropDownList>
+                <w:dropDownList w:lastValue="Lower is better">
                   <w:listItem w:displayText="Select ▾" w:value=""/>
                   <w:listItem w:displayText="Lower is better" w:value="Lower is better"/>
                   <w:listItem w:displayText="Higher is better" w:value="Higher is better"/>
@@ -8697,9 +8560,8 @@
                 <w:r>
                   <w:rPr>
                     <w:sz w:val="14"/>
-                    <w:szCs w:val="14"/>
                   </w:rPr>
-                  <w:t xml:space="preserve">Select ▾</w:t>
+                  <w:t xml:space="preserve">Lower is better</w:t>
                 </w:r>
               </w:sdtContent>
             </w:sdt>
@@ -8754,10 +8616,9 @@
               <w:sdtContent>
                 <w:r>
                   <w:rPr>
-                    <w:sz w:val="15"/>
-                    <w:szCs w:val="15"/>
+                    <w:sz w:val="14"/>
                   </w:rPr>
-                  <w:t xml:space="preserve">type here</w:t>
+                  <w:t xml:space="preserve">Final study pending</w:t>
                 </w:r>
               </w:sdtContent>
             </w:sdt>
@@ -8786,10 +8647,9 @@
               <w:sdtContent>
                 <w:r>
                   <w:rPr>
-                    <w:sz w:val="15"/>
-                    <w:szCs w:val="15"/>
+                    <w:sz w:val="14"/>
                   </w:rPr>
-                  <w:t xml:space="preserve">type here</w:t>
+                  <w:t xml:space="preserve">Pending frozen final batch</w:t>
                 </w:r>
               </w:sdtContent>
             </w:sdt>
@@ -8818,10 +8678,9 @@
               <w:sdtContent>
                 <w:r>
                   <w:rPr>
-                    <w:sz w:val="15"/>
-                    <w:szCs w:val="15"/>
+                    <w:sz w:val="14"/>
                   </w:rPr>
-                  <w:t xml:space="preserve">type here</w:t>
+                  <w:t xml:space="preserve">Pending frozen final batch</w:t>
                 </w:r>
               </w:sdtContent>
             </w:sdt>
@@ -8850,10 +8709,9 @@
               <w:sdtContent>
                 <w:r>
                   <w:rPr>
-                    <w:sz w:val="15"/>
-                    <w:szCs w:val="15"/>
+                    <w:sz w:val="14"/>
                   </w:rPr>
-                  <w:t xml:space="preserve">type here</w:t>
+                  <w:t xml:space="preserve">N²·m²·s</w:t>
                 </w:r>
               </w:sdtContent>
             </w:sdt>
@@ -8877,7 +8735,7 @@
                 </w:rPr>
                 <w:alias w:val="M06.S4.effort.better"/>
                 <w:tag w:val="M06.S4.effort.better"/>
-                <w:dropDownList>
+                <w:dropDownList w:lastValue="Lower is better">
                   <w:listItem w:displayText="Select ▾" w:value=""/>
                   <w:listItem w:displayText="Lower is better" w:value="Lower is better"/>
                   <w:listItem w:displayText="Higher is better" w:value="Higher is better"/>
@@ -8887,9 +8745,8 @@
                 <w:r>
                   <w:rPr>
                     <w:sz w:val="14"/>
-                    <w:szCs w:val="14"/>
                   </w:rPr>
-                  <w:t xml:space="preserve">Select ▾</w:t>
+                  <w:t xml:space="preserve">Lower is better</w:t>
                 </w:r>
               </w:sdtContent>
             </w:sdt>
@@ -8922,10 +8779,9 @@
               <w:sdtContent>
                 <w:r>
                   <w:rPr>
-                    <w:sz w:val="15"/>
-                    <w:szCs w:val="15"/>
+                    <w:sz w:val="14"/>
                   </w:rPr>
-                  <w:t xml:space="preserve">type here</w:t>
+                  <w:t xml:space="preserve">Final-model nominal combined demonstration (not a controller comparison)</w:t>
                 </w:r>
               </w:sdtContent>
             </w:sdt>
@@ -8953,10 +8809,9 @@
               <w:sdtContent>
                 <w:r>
                   <w:rPr>
-                    <w:sz w:val="15"/>
-                    <w:szCs w:val="15"/>
+                    <w:sz w:val="14"/>
                   </w:rPr>
-                  <w:t xml:space="preserve">type here</w:t>
+                  <w:t xml:space="preserve">1 development validation + identical recording</w:t>
                 </w:r>
               </w:sdtContent>
             </w:sdt>
@@ -8984,10 +8839,9 @@
               <w:sdtContent>
                 <w:r>
                   <w:rPr>
-                    <w:sz w:val="15"/>
-                    <w:szCs w:val="15"/>
+                    <w:sz w:val="14"/>
                   </w:rPr>
-                  <w:t xml:space="preserve">type here</w:t>
+                  <w:t xml:space="preserve">Not assessed in nominal development demonstration</w:t>
                 </w:r>
               </w:sdtContent>
             </w:sdt>
@@ -9015,10 +8869,9 @@
               <w:sdtContent>
                 <w:r>
                   <w:rPr>
-                    <w:sz w:val="15"/>
-                    <w:szCs w:val="15"/>
+                    <w:sz w:val="14"/>
                   </w:rPr>
-                  <w:t xml:space="preserve">type here</w:t>
+                  <w:t xml:space="preserve">CLEAN_AND_HOME at 610.858 s; 32/32 patches below threshold; 120 g solid retained; 89.97917% whole-panel footprint</w:t>
                 </w:r>
               </w:sdtContent>
             </w:sdt>
@@ -9046,10 +8899,9 @@
               <w:sdtContent>
                 <w:r>
                   <w:rPr>
-                    <w:sz w:val="15"/>
-                    <w:szCs w:val="15"/>
+                    <w:sz w:val="14"/>
                   </w:rPr>
-                  <w:t xml:space="preserve">type here</w:t>
+                  <w:t xml:space="preserve">status; s; %</w:t>
                 </w:r>
               </w:sdtContent>
             </w:sdt>
@@ -9072,7 +8924,7 @@
                 </w:rPr>
                 <w:alias w:val="M06.S4.metric.better"/>
                 <w:tag w:val="M06.S4.metric.better"/>
-                <w:dropDownList>
+                <w:dropDownList w:lastValue="Higher is better">
                   <w:listItem w:displayText="Select ▾" w:value=""/>
                   <w:listItem w:displayText="Lower is better" w:value="Lower is better"/>
                   <w:listItem w:displayText="Higher is better" w:value="Higher is better"/>
@@ -9082,9 +8934,8 @@
                 <w:r>
                   <w:rPr>
                     <w:sz w:val="14"/>
-                    <w:szCs w:val="14"/>
                   </w:rPr>
-                  <w:t xml:space="preserve">Select ▾</w:t>
+                  <w:t xml:space="preserve">Higher is better</w:t>
                 </w:r>
               </w:sdtContent>
             </w:sdt>
@@ -9153,7 +9004,7 @@
                 </w:rPr>
                 <w:alias w:val="M06.S4.test"/>
                 <w:tag w:val="M06.S4.test"/>
-                <w:dropDownList>
+                <w:dropDownList w:lastValue="Welch's t-test">
                   <w:listItem w:displayText="Select ▾" w:value=""/>
                   <w:listItem w:displayText="Welch's t-test" w:value="Welch's t-test"/>
                   <w:listItem w:displayText="Student's t-test (equal variance)" w:value="Student's t-test (equal variance)"/>
@@ -9164,10 +9015,9 @@
               <w:sdtContent>
                 <w:r>
                   <w:rPr>
-                    <w:sz w:val="15"/>
-                    <w:szCs w:val="15"/>
+                    <w:sz w:val="14"/>
                   </w:rPr>
-                  <w:t xml:space="preserve">Select ▾</w:t>
+                  <w:t xml:space="preserve">Welch's t-test</w:t>
                 </w:r>
               </w:sdtContent>
             </w:sdt>
@@ -9223,10 +9073,9 @@
               <w:sdtContent>
                 <w:r>
                   <w:rPr>
-                    <w:sz w:val="15"/>
-                    <w:szCs w:val="15"/>
+                    <w:sz w:val="14"/>
                   </w:rPr>
-                  <w:t xml:space="preserve">type here</w:t>
+                  <w:t xml:space="preserve">HISTORICAL only: t=-432.7779, df=40.5339, p=6.62045e-76; tiny seed variance and narrow scope limit interpretation.</w:t>
                 </w:r>
               </w:sdtContent>
             </w:sdt>
@@ -9282,10 +9131,9 @@
               <w:sdtContent>
                 <w:r>
                   <w:rPr>
-                    <w:sz w:val="15"/>
-                    <w:szCs w:val="15"/>
+                    <w:sz w:val="14"/>
                   </w:rPr>
-                  <w:t xml:space="preserve">type here</w:t>
+                  <w:t xml:space="preserve">-111.74278 (proposed minus baseline, historical study only)</w:t>
                 </w:r>
               </w:sdtContent>
             </w:sdt>
@@ -9339,10 +9187,9 @@
               <w:sdtContent>
                 <w:r>
                   <w:rPr>
-                    <w:sz w:val="15"/>
-                    <w:szCs w:val="15"/>
+                    <w:sz w:val="14"/>
                   </w:rPr>
-                  <w:t xml:space="preserve">type here</w:t>
+                  <w:t xml:space="preserve">[-0.09453698, -0.09365847] m, historical study only. No final-system statistical result is claimed.</w:t>
                 </w:r>
               </w:sdtContent>
             </w:sdt>
@@ -9369,7 +9216,6 @@
       </w:tblGrid>
       <w:tr>
         <w:trPr>
-          <w:trHeight w:val="2608" w:hRule="exact"/>
           <w:cantSplit/>
         </w:trPr>
         <w:tc>
@@ -9378,19 +9224,48 @@
             <w:shd w:val="clear" w:color="auto" w:fill="F2F2F2"/>
           </w:tcPr>
           <w:p>
-            <w:pPr>
-              <w:spacing w:after="0"/>
-              <w:jc w:val="center"/>
-            </w:pPr>
-            <w:r/>
+            <w:r/>
+            <w:r>
+              <w:drawing>
+                <wp:inline xmlns:a="http://schemas.openxmlformats.org/drawingml/2006/main" xmlns:pic="http://schemas.openxmlformats.org/drawingml/2006/picture">
+                  <wp:extent cx="2880360" cy="1920240"/>
+                  <wp:docPr id="4" name="Picture 4"/>
+                  <wp:cNvGraphicFramePr>
+                    <a:graphicFrameLocks noChangeAspect="1"/>
+                  </wp:cNvGraphicFramePr>
+                  <a:graphic>
+                    <a:graphicData uri="http://schemas.openxmlformats.org/drawingml/2006/picture">
+                      <pic:pic>
+                        <pic:nvPicPr>
+                          <pic:cNvPr id="0" name="collection_evidence.png"/>
+                          <pic:cNvPicPr/>
+                        </pic:nvPicPr>
+                        <pic:blipFill>
+                          <a:blip r:embed="rId13"/>
+                          <a:stretch>
+                            <a:fillRect/>
+                          </a:stretch>
+                        </pic:blipFill>
+                        <pic:spPr>
+                          <a:xfrm>
+                            <a:off x="0" y="0"/>
+                            <a:ext cx="2880360" cy="1920240"/>
+                          </a:xfrm>
+                          <a:prstGeom prst="rect"/>
+                        </pic:spPr>
+                      </pic:pic>
+                    </a:graphicData>
+                  </a:graphic>
+                </wp:inline>
+              </w:drawing>
+            </w:r>
+          </w:p>
+          <w:p>
             <w:r>
               <w:rPr>
-                <w:b w:val="0"/>
-                <w:i/>
-                <w:color w:val="595959"/>
-                <w:sz w:val="15"/>
+                <w:sz w:val="14"/>
               </w:rPr>
-              <w:t>[ Trajectory plot: reference vs actual, one representative run ]</w:t>
+              <w:t>One completed nominal final-model demonstration; not Monte Carlo evidence.</w:t>
             </w:r>
           </w:p>
         </w:tc>
@@ -9400,19 +9275,48 @@
             <w:shd w:val="clear" w:color="auto" w:fill="F2F2F2"/>
           </w:tcPr>
           <w:p>
-            <w:pPr>
-              <w:spacing w:after="0"/>
-              <w:jc w:val="center"/>
-            </w:pPr>
-            <w:r/>
+            <w:r/>
+            <w:r>
+              <w:drawing>
+                <wp:inline xmlns:a="http://schemas.openxmlformats.org/drawingml/2006/main" xmlns:pic="http://schemas.openxmlformats.org/drawingml/2006/picture">
+                  <wp:extent cx="2880360" cy="1645920"/>
+                  <wp:docPr id="5" name="Picture 5"/>
+                  <wp:cNvGraphicFramePr>
+                    <a:graphicFrameLocks noChangeAspect="1"/>
+                  </wp:cNvGraphicFramePr>
+                  <a:graphic>
+                    <a:graphicData uri="http://schemas.openxmlformats.org/drawingml/2006/picture">
+                      <pic:pic>
+                        <pic:nvPicPr>
+                          <pic:cNvPr id="0" name="tracking_comparison.png"/>
+                          <pic:cNvPicPr/>
+                        </pic:nvPicPr>
+                        <pic:blipFill>
+                          <a:blip r:embed="rId14"/>
+                          <a:stretch>
+                            <a:fillRect/>
+                          </a:stretch>
+                        </pic:blipFill>
+                        <pic:spPr>
+                          <a:xfrm>
+                            <a:off x="0" y="0"/>
+                            <a:ext cx="2880360" cy="1645920"/>
+                          </a:xfrm>
+                          <a:prstGeom prst="rect"/>
+                        </pic:spPr>
+                      </pic:pic>
+                    </a:graphicData>
+                  </a:graphic>
+                </wp:inline>
+              </w:drawing>
+            </w:r>
+          </w:p>
+          <w:p>
             <w:r>
               <w:rPr>
-                <w:b w:val="0"/>
-                <w:i/>
-                <w:color w:val="595959"/>
-                <w:sz w:val="15"/>
+                <w:sz w:val="14"/>
               </w:rPr>
-              <w:t>[ Box-plot of the primary metric: baseline vs proposed, N runs each ]</w:t>
+              <w:t>HISTORICAL 30-second earlier-model comparison; kept separate from pending final batch.</w:t>
             </w:r>
           </w:p>
         </w:tc>
@@ -9494,7 +9398,7 @@
                 </w:rPr>
                 <w:alias w:val="M06.S4.prov_own_runs"/>
                 <w:tag w:val="M06.S4.prov_own_runs"/>
-                <w:dropDownList>
+                <w:dropDownList w:lastValue="Yes">
                   <w:listItem w:displayText="Select ▾" w:value=""/>
                   <w:listItem w:displayText="Yes" w:value="Yes"/>
                   <w:listItem w:displayText="No" w:value="No"/>
@@ -9503,10 +9407,9 @@
               <w:sdtContent>
                 <w:r>
                   <w:rPr>
-                    <w:sz w:val="15"/>
-                    <w:szCs w:val="15"/>
+                    <w:sz w:val="14"/>
                   </w:rPr>
-                  <w:t xml:space="preserve">Select ▾</w:t>
+                  <w:t xml:space="preserve">Yes</w:t>
                 </w:r>
               </w:sdtContent>
             </w:sdt>
@@ -9557,7 +9460,7 @@
                 </w:rPr>
                 <w:alias w:val="M06.S4.prov_no_simulated"/>
                 <w:tag w:val="M06.S4.prov_no_simulated"/>
-                <w:dropDownList>
+                <w:dropDownList w:lastValue="Yes">
                   <w:listItem w:displayText="Select ▾" w:value=""/>
                   <w:listItem w:displayText="Yes" w:value="Yes"/>
                   <w:listItem w:displayText="No" w:value="No"/>
@@ -9566,10 +9469,9 @@
               <w:sdtContent>
                 <w:r>
                   <w:rPr>
-                    <w:sz w:val="15"/>
-                    <w:szCs w:val="15"/>
+                    <w:sz w:val="14"/>
                   </w:rPr>
-                  <w:t xml:space="preserve">Select ▾</w:t>
+                  <w:t xml:space="preserve">Yes</w:t>
                 </w:r>
               </w:sdtContent>
             </w:sdt>
@@ -9620,7 +9522,7 @@
                 </w:rPr>
                 <w:alias w:val="M06.S4.prov_plots_reproducible"/>
                 <w:tag w:val="M06.S4.prov_plots_reproducible"/>
-                <w:dropDownList>
+                <w:dropDownList w:lastValue="Yes">
                   <w:listItem w:displayText="Select ▾" w:value=""/>
                   <w:listItem w:displayText="Yes" w:value="Yes"/>
                   <w:listItem w:displayText="No" w:value="No"/>
@@ -9629,10 +9531,9 @@
               <w:sdtContent>
                 <w:r>
                   <w:rPr>
-                    <w:sz w:val="15"/>
-                    <w:szCs w:val="15"/>
+                    <w:sz w:val="14"/>
                   </w:rPr>
-                  <w:t xml:space="preserve">Select ▾</w:t>
+                  <w:t xml:space="preserve">Yes</w:t>
                 </w:r>
               </w:sdtContent>
             </w:sdt>
@@ -9681,7 +9582,7 @@
                 </w:rPr>
                 <w:alias w:val="M06.S4.prov_economics_sourced"/>
                 <w:tag w:val="M06.S4.prov_economics_sourced"/>
-                <w:dropDownList>
+                <w:dropDownList w:lastValue="Yes">
                   <w:listItem w:displayText="Select ▾" w:value=""/>
                   <w:listItem w:displayText="Yes" w:value="Yes"/>
                   <w:listItem w:displayText="No" w:value="No"/>
@@ -9690,10 +9591,9 @@
               <w:sdtContent>
                 <w:r>
                   <w:rPr>
-                    <w:sz w:val="15"/>
-                    <w:szCs w:val="15"/>
+                    <w:sz w:val="14"/>
                   </w:rPr>
-                  <w:t xml:space="preserve">Select ▾</w:t>
+                  <w:t xml:space="preserve">Yes</w:t>
                 </w:r>
               </w:sdtContent>
             </w:sdt>
@@ -9794,10 +9694,9 @@
               <w:sdtContent>
                 <w:r>
                   <w:rPr>
-                    <w:sz w:val="15"/>
-                    <w:szCs w:val="15"/>
+                    <w:sz w:val="14"/>
                   </w:rPr>
-                  <w:t xml:space="preserve">type here</w:t>
+                  <w:t xml:space="preserve">PENDING TEAM ACTION: post the actual team video and paste its public URL.</w:t>
                 </w:r>
               </w:sdtContent>
             </w:sdt>
@@ -9853,10 +9752,9 @@
               <w:sdtContent>
                 <w:r>
                   <w:rPr>
-                    <w:sz w:val="15"/>
-                    <w:szCs w:val="15"/>
+                    <w:sz w:val="14"/>
                   </w:rPr>
-                  <w:t xml:space="preserve">type here</w:t>
+                  <w:t xml:space="preserve">Source simulation: 03:20.40; final 3–4 minute team presentation with every member speaking is pending.</w:t>
                 </w:r>
               </w:sdtContent>
             </w:sdt>
@@ -9916,8 +9814,8 @@
               <w:sdtContent>
                 <w:r>
                   <w:rPr>
-                    <w:sz w:val="15"/>
-                    <w:szCs w:val="15"/>
+                    <w:sz w:val="14"/>
+                    <w:highlight w:val="yellow"/>
                   </w:rPr>
                   <w:t xml:space="preserve">Select ▾</w:t>
                 </w:r>
@@ -9979,8 +9877,8 @@
               <w:sdtContent>
                 <w:r>
                   <w:rPr>
-                    <w:sz w:val="15"/>
-                    <w:szCs w:val="15"/>
+                    <w:sz w:val="14"/>
+                    <w:highlight w:val="yellow"/>
                   </w:rPr>
                   <w:t xml:space="preserve">Select ▾</w:t>
                 </w:r>
@@ -10040,8 +9938,8 @@
               <w:sdtContent>
                 <w:r>
                   <w:rPr>
-                    <w:sz w:val="15"/>
-                    <w:szCs w:val="15"/>
+                    <w:sz w:val="14"/>
+                    <w:highlight w:val="yellow"/>
                   </w:rPr>
                   <w:t xml:space="preserve">Select ▾</w:t>
                 </w:r>
@@ -10264,7 +10162,6 @@
       </w:tr>
       <w:tr>
         <w:trPr>
-          <w:trHeight w:val="624" w:hRule="atLeast"/>
           <w:cantSplit/>
         </w:trPr>
         <w:tc>
@@ -10306,7 +10203,7 @@
                 </w:rPr>
                 <w:alias w:val="M06.S5.ai1.tool"/>
                 <w:tag w:val="M06.S5.ai1.tool"/>
-                <w:dropDownList>
+                <w:dropDownList w:lastValue="ChatGPT">
                   <w:listItem w:displayText="Select ▾" w:value=""/>
                   <w:listItem w:displayText="ChatGPT" w:value="ChatGPT"/>
                   <w:listItem w:displayText="Gemini" w:value="Gemini"/>
@@ -10321,9 +10218,8 @@
                 <w:r>
                   <w:rPr>
                     <w:sz w:val="14"/>
-                    <w:szCs w:val="14"/>
                   </w:rPr>
-                  <w:t xml:space="preserve">Select ▾</w:t>
+                  <w:t xml:space="preserve">ChatGPT</w:t>
                 </w:r>
               </w:sdtContent>
             </w:sdt>
@@ -10353,9 +10249,8 @@
                 <w:r>
                   <w:rPr>
                     <w:sz w:val="14"/>
-                    <w:szCs w:val="14"/>
                   </w:rPr>
-                  <w:t xml:space="preserve">type here</w:t>
+                  <w:t xml:space="preserve">Conditional import mujoco.viewer inside mission was expected to work, but shadowed the module name and raised UnboundLocalError before model construction.</w:t>
                 </w:r>
               </w:sdtContent>
             </w:sdt>
@@ -10379,7 +10274,7 @@
                 </w:rPr>
                 <w:alias w:val="M06.S5.ai1.caught_by"/>
                 <w:tag w:val="M06.S5.ai1.caught_by"/>
-                <w:dropDownList>
+                <w:dropDownList w:lastValue="Ran / tested the code or simulation">
                   <w:listItem w:displayText="Select ▾" w:value=""/>
                   <w:listItem w:displayText="Checked the original source" w:value="Checked the original source"/>
                   <w:listItem w:displayText="Textbook" w:value="Textbook"/>
@@ -10394,9 +10289,8 @@
                 <w:r>
                   <w:rPr>
                     <w:sz w:val="14"/>
-                    <w:szCs w:val="14"/>
                   </w:rPr>
-                  <w:t xml:space="preserve">Select ▾</w:t>
+                  <w:t xml:space="preserve">Ran / tested the code or simulation</w:t>
                 </w:r>
               </w:sdtContent>
             </w:sdt>
@@ -10426,9 +10320,8 @@
                 <w:r>
                   <w:rPr>
                     <w:sz w:val="14"/>
-                    <w:szCs w:val="14"/>
                   </w:rPr>
-                  <w:t xml:space="preserve">type here</w:t>
+                  <w:t xml:space="preserve">Use from mujoco import viewer as mj_viewer. Actual mission/integration tests execute model construction. See docs/AI_AUDIT.md and controller import. Development audit candidate: members must review before claiming personal verification.</w:t>
                 </w:r>
               </w:sdtContent>
             </w:sdt>
@@ -10452,7 +10345,7 @@
                 </w:rPr>
                 <w:alias w:val="M06.S5.ai1.error_type"/>
                 <w:tag w:val="M06.S5.ai1.error_type"/>
-                <w:dropDownList>
+                <w:dropDownList w:lastValue="Wrong code / MuJoCo API">
                   <w:listItem w:displayText="Select ▾" w:value=""/>
                   <w:listItem w:displayText="Fabricated source / citation" w:value="Fabricated source / citation"/>
                   <w:listItem w:displayText="Real source, wrong details (author, year, venue)" w:value="Real source, wrong details (author, year, venue)"/>
@@ -10468,9 +10361,8 @@
                 <w:r>
                   <w:rPr>
                     <w:sz w:val="14"/>
-                    <w:szCs w:val="14"/>
                   </w:rPr>
-                  <w:t xml:space="preserve">Select ▾</w:t>
+                  <w:t xml:space="preserve">Wrong code / MuJoCo API</w:t>
                 </w:r>
               </w:sdtContent>
             </w:sdt>
@@ -10494,7 +10386,7 @@
                 </w:rPr>
                 <w:alias w:val="M06.S5.ai1.verdict"/>
                 <w:tag w:val="M06.S5.ai1.verdict"/>
-                <w:dropDownList>
+                <w:dropDownList w:lastValue="Corrected">
                   <w:listItem w:displayText="Select ▾" w:value=""/>
                   <w:listItem w:displayText="Rejected" w:value="Rejected"/>
                   <w:listItem w:displayText="Corrected" w:value="Corrected"/>
@@ -10505,9 +10397,8 @@
                 <w:r>
                   <w:rPr>
                     <w:sz w:val="14"/>
-                    <w:szCs w:val="14"/>
                   </w:rPr>
-                  <w:t xml:space="preserve">Select ▾</w:t>
+                  <w:t xml:space="preserve">Corrected</w:t>
                 </w:r>
               </w:sdtContent>
             </w:sdt>
@@ -10516,7 +10407,6 @@
       </w:tr>
       <w:tr>
         <w:trPr>
-          <w:trHeight w:val="624" w:hRule="atLeast"/>
           <w:cantSplit/>
         </w:trPr>
         <w:tc>
@@ -10558,7 +10448,7 @@
                 </w:rPr>
                 <w:alias w:val="M06.S5.ai2.tool"/>
                 <w:tag w:val="M06.S5.ai2.tool"/>
-                <w:dropDownList>
+                <w:dropDownList w:lastValue="ChatGPT">
                   <w:listItem w:displayText="Select ▾" w:value=""/>
                   <w:listItem w:displayText="ChatGPT" w:value="ChatGPT"/>
                   <w:listItem w:displayText="Gemini" w:value="Gemini"/>
@@ -10573,9 +10463,8 @@
                 <w:r>
                   <w:rPr>
                     <w:sz w:val="14"/>
-                    <w:szCs w:val="14"/>
                   </w:rPr>
-                  <w:t xml:space="preserve">Select ▾</w:t>
+                  <w:t xml:space="preserve">ChatGPT</w:t>
                 </w:r>
               </w:sdtContent>
             </w:sdt>
@@ -10605,9 +10494,8 @@
                 <w:r>
                   <w:rPr>
                     <w:sz w:val="14"/>
-                    <w:szCs w:val="14"/>
                   </w:rPr>
-                  <w:t xml:space="preserve">type here</w:t>
+                  <w:t xml:space="preserve">RMS distance to the next waypoint was initially labelled path-tracking RMSE.</w:t>
                 </w:r>
               </w:sdtContent>
             </w:sdt>
@@ -10631,7 +10519,7 @@
                 </w:rPr>
                 <w:alias w:val="M06.S5.ai2.caught_by"/>
                 <w:tag w:val="M06.S5.ai2.caught_by"/>
-                <w:dropDownList>
+                <w:dropDownList w:lastValue="Ran / tested the code or simulation">
                   <w:listItem w:displayText="Select ▾" w:value=""/>
                   <w:listItem w:displayText="Checked the original source" w:value="Checked the original source"/>
                   <w:listItem w:displayText="Textbook" w:value="Textbook"/>
@@ -10646,9 +10534,8 @@
                 <w:r>
                   <w:rPr>
                     <w:sz w:val="14"/>
-                    <w:szCs w:val="14"/>
                   </w:rPr>
-                  <w:t xml:space="preserve">Select ▾</w:t>
+                  <w:t xml:space="preserve">Ran / tested the code or simulation</w:t>
                 </w:r>
               </w:sdtContent>
             </w:sdt>
@@ -10678,9 +10565,8 @@
                 <w:r>
                   <w:rPr>
                     <w:sz w:val="14"/>
-                    <w:szCs w:val="14"/>
                   </w:rPr>
-                  <w:t xml:space="preserve">type here</w:t>
+                  <w:t xml:space="preserve">Measure distance to the active segment using projection; tests/test_geometry_economics.py checks a 0.2 m perpendicular error. Time-indexed tracking is not claimed. Development audit candidate: members must review before claiming personal verification.</w:t>
                 </w:r>
               </w:sdtContent>
             </w:sdt>
@@ -10704,7 +10590,7 @@
                 </w:rPr>
                 <w:alias w:val="M06.S5.ai2.error_type"/>
                 <w:tag w:val="M06.S5.ai2.error_type"/>
-                <w:dropDownList>
+                <w:dropDownList w:lastValue="Wrong number or statistic">
                   <w:listItem w:displayText="Select ▾" w:value=""/>
                   <w:listItem w:displayText="Fabricated source / citation" w:value="Fabricated source / citation"/>
                   <w:listItem w:displayText="Real source, wrong details (author, year, venue)" w:value="Real source, wrong details (author, year, venue)"/>
@@ -10720,9 +10606,8 @@
                 <w:r>
                   <w:rPr>
                     <w:sz w:val="14"/>
-                    <w:szCs w:val="14"/>
                   </w:rPr>
-                  <w:t xml:space="preserve">Select ▾</w:t>
+                  <w:t xml:space="preserve">Wrong number or statistic</w:t>
                 </w:r>
               </w:sdtContent>
             </w:sdt>
@@ -10746,7 +10631,7 @@
                 </w:rPr>
                 <w:alias w:val="M06.S5.ai2.verdict"/>
                 <w:tag w:val="M06.S5.ai2.verdict"/>
-                <w:dropDownList>
+                <w:dropDownList w:lastValue="Corrected">
                   <w:listItem w:displayText="Select ▾" w:value=""/>
                   <w:listItem w:displayText="Rejected" w:value="Rejected"/>
                   <w:listItem w:displayText="Corrected" w:value="Corrected"/>
@@ -10757,9 +10642,8 @@
                 <w:r>
                   <w:rPr>
                     <w:sz w:val="14"/>
-                    <w:szCs w:val="14"/>
                   </w:rPr>
-                  <w:t xml:space="preserve">Select ▾</w:t>
+                  <w:t xml:space="preserve">Corrected</w:t>
                 </w:r>
               </w:sdtContent>
             </w:sdt>
@@ -10768,7 +10652,6 @@
       </w:tr>
       <w:tr>
         <w:trPr>
-          <w:trHeight w:val="624" w:hRule="atLeast"/>
           <w:cantSplit/>
         </w:trPr>
         <w:tc>
@@ -10808,7 +10691,7 @@
                 </w:rPr>
                 <w:alias w:val="M06.S5.ai3.tool"/>
                 <w:tag w:val="M06.S5.ai3.tool"/>
-                <w:dropDownList>
+                <w:dropDownList w:lastValue="ChatGPT">
                   <w:listItem w:displayText="Select ▾" w:value=""/>
                   <w:listItem w:displayText="ChatGPT" w:value="ChatGPT"/>
                   <w:listItem w:displayText="Gemini" w:value="Gemini"/>
@@ -10823,9 +10706,8 @@
                 <w:r>
                   <w:rPr>
                     <w:sz w:val="14"/>
-                    <w:szCs w:val="14"/>
                   </w:rPr>
-                  <w:t xml:space="preserve">Select ▾</w:t>
+                  <w:t xml:space="preserve">ChatGPT</w:t>
                 </w:r>
               </w:sdtContent>
             </w:sdt>
@@ -10854,9 +10736,8 @@
                 <w:r>
                   <w:rPr>
                     <w:sz w:val="14"/>
-                    <w:szCs w:val="14"/>
                   </w:rPr>
-                  <w:t xml:space="preserve">type here</w:t>
+                  <w:t xml:space="preserve">Computing source hashes at run completion could label an earlier executed model with later edits.</w:t>
                 </w:r>
               </w:sdtContent>
             </w:sdt>
@@ -10879,7 +10760,7 @@
                 </w:rPr>
                 <w:alias w:val="M06.S5.ai3.caught_by"/>
                 <w:tag w:val="M06.S5.ai3.caught_by"/>
-                <w:dropDownList>
+                <w:dropDownList w:lastValue="Ran / tested the code or simulation">
                   <w:listItem w:displayText="Select ▾" w:value=""/>
                   <w:listItem w:displayText="Checked the original source" w:value="Checked the original source"/>
                   <w:listItem w:displayText="Textbook" w:value="Textbook"/>
@@ -10894,9 +10775,8 @@
                 <w:r>
                   <w:rPr>
                     <w:sz w:val="14"/>
-                    <w:szCs w:val="14"/>
                   </w:rPr>
-                  <w:t xml:space="preserve">Select ▾</w:t>
+                  <w:t xml:space="preserve">Ran / tested the code or simulation</w:t>
                 </w:r>
               </w:sdtContent>
             </w:sdt>
@@ -10925,9 +10805,8 @@
                 <w:r>
                   <w:rPr>
                     <w:sz w:val="14"/>
-                    <w:szCs w:val="14"/>
                   </w:rPr>
-                  <w:t xml:space="preserve">type here</w:t>
+                  <w:t xml:space="preserve">Capture hashes at launch and preserve immutable source snapshots. Final batch protocol records launch hashes; executed source is frozen. See docs/AI_AUDIT.md. Development audit candidate: members must review before claiming personal verification.</w:t>
                 </w:r>
               </w:sdtContent>
             </w:sdt>
@@ -10950,7 +10829,7 @@
                 </w:rPr>
                 <w:alias w:val="M06.S5.ai3.error_type"/>
                 <w:tag w:val="M06.S5.ai3.error_type"/>
-                <w:dropDownList>
+                <w:dropDownList w:lastValue="Wrong code / MuJoCo API">
                   <w:listItem w:displayText="Select ▾" w:value=""/>
                   <w:listItem w:displayText="Fabricated source / citation" w:value="Fabricated source / citation"/>
                   <w:listItem w:displayText="Real source, wrong details (author, year, venue)" w:value="Real source, wrong details (author, year, venue)"/>
@@ -10966,9 +10845,8 @@
                 <w:r>
                   <w:rPr>
                     <w:sz w:val="14"/>
-                    <w:szCs w:val="14"/>
                   </w:rPr>
-                  <w:t xml:space="preserve">Select ▾</w:t>
+                  <w:t xml:space="preserve">Wrong code / MuJoCo API</w:t>
                 </w:r>
               </w:sdtContent>
             </w:sdt>
@@ -10991,7 +10869,7 @@
                 </w:rPr>
                 <w:alias w:val="M06.S5.ai3.verdict"/>
                 <w:tag w:val="M06.S5.ai3.verdict"/>
-                <w:dropDownList>
+                <w:dropDownList w:lastValue="Corrected">
                   <w:listItem w:displayText="Select ▾" w:value=""/>
                   <w:listItem w:displayText="Rejected" w:value="Rejected"/>
                   <w:listItem w:displayText="Corrected" w:value="Corrected"/>
@@ -11002,9 +10880,8 @@
                 <w:r>
                   <w:rPr>
                     <w:sz w:val="14"/>
-                    <w:szCs w:val="14"/>
                   </w:rPr>
-                  <w:t xml:space="preserve">Select ▾</w:t>
+                  <w:t xml:space="preserve">Corrected</w:t>
                 </w:r>
               </w:sdtContent>
             </w:sdt>
@@ -11233,7 +11110,6 @@
       </w:tr>
       <w:tr>
         <w:trPr>
-          <w:trHeight w:val="510" w:hRule="atLeast"/>
           <w:cantSplit/>
         </w:trPr>
         <w:tc>
@@ -11286,7 +11162,7 @@
                 <w:r>
                   <w:rPr>
                     <w:sz w:val="14"/>
-                    <w:szCs w:val="14"/>
+                    <w:highlight w:val="yellow"/>
                   </w:rPr>
                   <w:t xml:space="preserve">Select ▾</w:t>
                 </w:r>
@@ -11323,7 +11199,7 @@
                 <w:r>
                   <w:rPr>
                     <w:sz w:val="14"/>
-                    <w:szCs w:val="14"/>
+                    <w:highlight w:val="yellow"/>
                   </w:rPr>
                   <w:t xml:space="preserve">Select ▾</w:t>
                 </w:r>
@@ -11360,7 +11236,7 @@
                 <w:r>
                   <w:rPr>
                     <w:sz w:val="14"/>
-                    <w:szCs w:val="14"/>
+                    <w:highlight w:val="yellow"/>
                   </w:rPr>
                   <w:t xml:space="preserve">Select ▾</w:t>
                 </w:r>
@@ -11397,7 +11273,7 @@
                 <w:r>
                   <w:rPr>
                     <w:sz w:val="14"/>
-                    <w:szCs w:val="14"/>
+                    <w:highlight w:val="yellow"/>
                   </w:rPr>
                   <w:t xml:space="preserve">Select ▾</w:t>
                 </w:r>
@@ -11434,7 +11310,7 @@
                 <w:r>
                   <w:rPr>
                     <w:sz w:val="14"/>
-                    <w:szCs w:val="14"/>
+                    <w:highlight w:val="yellow"/>
                   </w:rPr>
                   <w:t xml:space="preserve">Select ▾</w:t>
                 </w:r>
@@ -11466,9 +11342,9 @@
                 <w:r>
                   <w:rPr>
                     <w:sz w:val="14"/>
-                    <w:szCs w:val="14"/>
+                    <w:highlight w:val="yellow"/>
                   </w:rPr>
-                  <w:t xml:space="preserve">type here</w:t>
+                  <w:t xml:space="preserve">MEMBER TO COMPLETE</w:t>
                 </w:r>
               </w:sdtContent>
             </w:sdt>
@@ -11498,9 +11374,9 @@
                 <w:r>
                   <w:rPr>
                     <w:sz w:val="14"/>
-                    <w:szCs w:val="14"/>
+                    <w:highlight w:val="yellow"/>
                   </w:rPr>
-                  <w:t xml:space="preserve">type here</w:t>
+                  <w:t xml:space="preserve">MEMBER TO COMPLETE</w:t>
                 </w:r>
               </w:sdtContent>
             </w:sdt>
@@ -11509,7 +11385,6 @@
       </w:tr>
       <w:tr>
         <w:trPr>
-          <w:trHeight w:val="510" w:hRule="atLeast"/>
           <w:cantSplit/>
         </w:trPr>
         <w:tc>
@@ -11560,7 +11435,7 @@
                 <w:r>
                   <w:rPr>
                     <w:sz w:val="14"/>
-                    <w:szCs w:val="14"/>
+                    <w:highlight w:val="yellow"/>
                   </w:rPr>
                   <w:t xml:space="preserve">Select ▾</w:t>
                 </w:r>
@@ -11596,7 +11471,7 @@
                 <w:r>
                   <w:rPr>
                     <w:sz w:val="14"/>
-                    <w:szCs w:val="14"/>
+                    <w:highlight w:val="yellow"/>
                   </w:rPr>
                   <w:t xml:space="preserve">Select ▾</w:t>
                 </w:r>
@@ -11632,7 +11507,7 @@
                 <w:r>
                   <w:rPr>
                     <w:sz w:val="14"/>
-                    <w:szCs w:val="14"/>
+                    <w:highlight w:val="yellow"/>
                   </w:rPr>
                   <w:t xml:space="preserve">Select ▾</w:t>
                 </w:r>
@@ -11668,7 +11543,7 @@
                 <w:r>
                   <w:rPr>
                     <w:sz w:val="14"/>
-                    <w:szCs w:val="14"/>
+                    <w:highlight w:val="yellow"/>
                   </w:rPr>
                   <w:t xml:space="preserve">Select ▾</w:t>
                 </w:r>
@@ -11704,7 +11579,7 @@
                 <w:r>
                   <w:rPr>
                     <w:sz w:val="14"/>
-                    <w:szCs w:val="14"/>
+                    <w:highlight w:val="yellow"/>
                   </w:rPr>
                   <w:t xml:space="preserve">Select ▾</w:t>
                 </w:r>
@@ -11735,9 +11610,9 @@
                 <w:r>
                   <w:rPr>
                     <w:sz w:val="14"/>
-                    <w:szCs w:val="14"/>
+                    <w:highlight w:val="yellow"/>
                   </w:rPr>
-                  <w:t xml:space="preserve">type here</w:t>
+                  <w:t xml:space="preserve">MEMBER TO COMPLETE</w:t>
                 </w:r>
               </w:sdtContent>
             </w:sdt>
@@ -11766,9 +11641,9 @@
                 <w:r>
                   <w:rPr>
                     <w:sz w:val="14"/>
-                    <w:szCs w:val="14"/>
+                    <w:highlight w:val="yellow"/>
                   </w:rPr>
-                  <w:t xml:space="preserve">type here</w:t>
+                  <w:t xml:space="preserve">MEMBER TO COMPLETE</w:t>
                 </w:r>
               </w:sdtContent>
             </w:sdt>
@@ -12024,7 +11899,6 @@
       </w:tr>
       <w:tr>
         <w:trPr>
-          <w:trHeight w:val="454" w:hRule="atLeast"/>
           <w:cantSplit/>
         </w:trPr>
         <w:tc>
@@ -12072,9 +11946,9 @@
                 <w:r>
                   <w:rPr>
                     <w:sz w:val="14"/>
-                    <w:szCs w:val="14"/>
+                    <w:highlight w:val="yellow"/>
                   </w:rPr>
-                  <w:t xml:space="preserve">type here</w:t>
+                  <w:t xml:space="preserve">MEMBER TO COMPLETE</w:t>
                 </w:r>
               </w:sdtContent>
             </w:sdt>
@@ -12111,7 +11985,7 @@
                 <w:r>
                   <w:rPr>
                     <w:sz w:val="14"/>
-                    <w:szCs w:val="14"/>
+                    <w:highlight w:val="yellow"/>
                   </w:rPr>
                   <w:t xml:space="preserve">Select ▾</w:t>
                 </w:r>
@@ -12147,7 +12021,7 @@
                 <w:r>
                   <w:rPr>
                     <w:sz w:val="14"/>
-                    <w:szCs w:val="14"/>
+                    <w:highlight w:val="yellow"/>
                   </w:rPr>
                   <w:t xml:space="preserve">Select ▾</w:t>
                 </w:r>
@@ -12179,9 +12053,9 @@
                 <w:r>
                   <w:rPr>
                     <w:sz w:val="14"/>
-                    <w:szCs w:val="14"/>
+                    <w:highlight w:val="yellow"/>
                   </w:rPr>
-                  <w:t xml:space="preserve">type here</w:t>
+                  <w:t xml:space="preserve">MEMBER TO COMPLETE</w:t>
                 </w:r>
               </w:sdtContent>
             </w:sdt>
@@ -12211,9 +12085,9 @@
                 <w:r>
                   <w:rPr>
                     <w:sz w:val="14"/>
-                    <w:szCs w:val="14"/>
+                    <w:highlight w:val="yellow"/>
                   </w:rPr>
-                  <w:t xml:space="preserve">type here</w:t>
+                  <w:t xml:space="preserve">MEMBER TO COMPLETE</w:t>
                 </w:r>
               </w:sdtContent>
             </w:sdt>
@@ -12249,7 +12123,7 @@
                 <w:r>
                   <w:rPr>
                     <w:sz w:val="14"/>
-                    <w:szCs w:val="14"/>
+                    <w:highlight w:val="yellow"/>
                   </w:rPr>
                   <w:t xml:space="preserve">Select ▾</w:t>
                 </w:r>
@@ -12287,7 +12161,7 @@
                 <w:r>
                   <w:rPr>
                     <w:sz w:val="14"/>
-                    <w:szCs w:val="14"/>
+                    <w:highlight w:val="yellow"/>
                   </w:rPr>
                   <w:t xml:space="preserve">Select ▾</w:t>
                 </w:r>
@@ -12298,7 +12172,6 @@
       </w:tr>
       <w:tr>
         <w:trPr>
-          <w:trHeight w:val="454" w:hRule="atLeast"/>
           <w:cantSplit/>
         </w:trPr>
         <w:tc>
@@ -12346,9 +12219,9 @@
                 <w:r>
                   <w:rPr>
                     <w:sz w:val="14"/>
-                    <w:szCs w:val="14"/>
+                    <w:highlight w:val="yellow"/>
                   </w:rPr>
-                  <w:t xml:space="preserve">type here</w:t>
+                  <w:t xml:space="preserve">MEMBER TO COMPLETE</w:t>
                 </w:r>
               </w:sdtContent>
             </w:sdt>
@@ -12385,7 +12258,7 @@
                 <w:r>
                   <w:rPr>
                     <w:sz w:val="14"/>
-                    <w:szCs w:val="14"/>
+                    <w:highlight w:val="yellow"/>
                   </w:rPr>
                   <w:t xml:space="preserve">Select ▾</w:t>
                 </w:r>
@@ -12421,7 +12294,7 @@
                 <w:r>
                   <w:rPr>
                     <w:sz w:val="14"/>
-                    <w:szCs w:val="14"/>
+                    <w:highlight w:val="yellow"/>
                   </w:rPr>
                   <w:t xml:space="preserve">Select ▾</w:t>
                 </w:r>
@@ -12453,9 +12326,9 @@
                 <w:r>
                   <w:rPr>
                     <w:sz w:val="14"/>
-                    <w:szCs w:val="14"/>
+                    <w:highlight w:val="yellow"/>
                   </w:rPr>
-                  <w:t xml:space="preserve">type here</w:t>
+                  <w:t xml:space="preserve">MEMBER TO COMPLETE</w:t>
                 </w:r>
               </w:sdtContent>
             </w:sdt>
@@ -12485,9 +12358,9 @@
                 <w:r>
                   <w:rPr>
                     <w:sz w:val="14"/>
-                    <w:szCs w:val="14"/>
+                    <w:highlight w:val="yellow"/>
                   </w:rPr>
-                  <w:t xml:space="preserve">type here</w:t>
+                  <w:t xml:space="preserve">MEMBER TO COMPLETE</w:t>
                 </w:r>
               </w:sdtContent>
             </w:sdt>
@@ -12523,7 +12396,7 @@
                 <w:r>
                   <w:rPr>
                     <w:sz w:val="14"/>
-                    <w:szCs w:val="14"/>
+                    <w:highlight w:val="yellow"/>
                   </w:rPr>
                   <w:t xml:space="preserve">Select ▾</w:t>
                 </w:r>
@@ -12561,7 +12434,7 @@
                 <w:r>
                   <w:rPr>
                     <w:sz w:val="14"/>
-                    <w:szCs w:val="14"/>
+                    <w:highlight w:val="yellow"/>
                   </w:rPr>
                   <w:t xml:space="preserve">Select ▾</w:t>
                 </w:r>
@@ -12572,7 +12445,6 @@
       </w:tr>
       <w:tr>
         <w:trPr>
-          <w:trHeight w:val="454" w:hRule="atLeast"/>
           <w:cantSplit/>
         </w:trPr>
         <w:tc>
@@ -12618,9 +12490,9 @@
                 <w:r>
                   <w:rPr>
                     <w:sz w:val="14"/>
-                    <w:szCs w:val="14"/>
+                    <w:highlight w:val="yellow"/>
                   </w:rPr>
-                  <w:t xml:space="preserve">type here</w:t>
+                  <w:t xml:space="preserve">MEMBER TO COMPLETE</w:t>
                 </w:r>
               </w:sdtContent>
             </w:sdt>
@@ -12656,7 +12528,7 @@
                 <w:r>
                   <w:rPr>
                     <w:sz w:val="14"/>
-                    <w:szCs w:val="14"/>
+                    <w:highlight w:val="yellow"/>
                   </w:rPr>
                   <w:t xml:space="preserve">Select ▾</w:t>
                 </w:r>
@@ -12691,7 +12563,7 @@
                 <w:r>
                   <w:rPr>
                     <w:sz w:val="14"/>
-                    <w:szCs w:val="14"/>
+                    <w:highlight w:val="yellow"/>
                   </w:rPr>
                   <w:t xml:space="preserve">Select ▾</w:t>
                 </w:r>
@@ -12722,9 +12594,9 @@
                 <w:r>
                   <w:rPr>
                     <w:sz w:val="14"/>
-                    <w:szCs w:val="14"/>
+                    <w:highlight w:val="yellow"/>
                   </w:rPr>
-                  <w:t xml:space="preserve">type here</w:t>
+                  <w:t xml:space="preserve">MEMBER TO COMPLETE</w:t>
                 </w:r>
               </w:sdtContent>
             </w:sdt>
@@ -12753,9 +12625,9 @@
                 <w:r>
                   <w:rPr>
                     <w:sz w:val="14"/>
-                    <w:szCs w:val="14"/>
+                    <w:highlight w:val="yellow"/>
                   </w:rPr>
-                  <w:t xml:space="preserve">type here</w:t>
+                  <w:t xml:space="preserve">MEMBER TO COMPLETE</w:t>
                 </w:r>
               </w:sdtContent>
             </w:sdt>
@@ -12790,7 +12662,7 @@
                 <w:r>
                   <w:rPr>
                     <w:sz w:val="14"/>
-                    <w:szCs w:val="14"/>
+                    <w:highlight w:val="yellow"/>
                   </w:rPr>
                   <w:t xml:space="preserve">Select ▾</w:t>
                 </w:r>
@@ -12827,7 +12699,7 @@
                 <w:r>
                   <w:rPr>
                     <w:sz w:val="14"/>
-                    <w:szCs w:val="14"/>
+                    <w:highlight w:val="yellow"/>
                   </w:rPr>
                   <w:t xml:space="preserve">Select ▾</w:t>
                 </w:r>
@@ -12951,7 +12823,6 @@
       </w:tr>
       <w:tr>
         <w:trPr>
-          <w:trHeight w:val="454" w:hRule="atLeast"/>
           <w:cantSplit/>
         </w:trPr>
         <w:tc>
@@ -13003,7 +12874,7 @@
                 <w:r>
                   <w:rPr>
                     <w:sz w:val="14"/>
-                    <w:szCs w:val="14"/>
+                    <w:highlight w:val="yellow"/>
                   </w:rPr>
                   <w:t xml:space="preserve">Select ▾</w:t>
                 </w:r>
@@ -13035,9 +12906,9 @@
                 <w:r>
                   <w:rPr>
                     <w:sz w:val="14"/>
-                    <w:szCs w:val="14"/>
+                    <w:highlight w:val="yellow"/>
                   </w:rPr>
-                  <w:t xml:space="preserve">type here</w:t>
+                  <w:t xml:space="preserve">MEMBER TO COMPLETE</w:t>
                 </w:r>
               </w:sdtContent>
             </w:sdt>
@@ -13067,9 +12938,9 @@
                 <w:r>
                   <w:rPr>
                     <w:sz w:val="14"/>
-                    <w:szCs w:val="14"/>
+                    <w:highlight w:val="yellow"/>
                   </w:rPr>
-                  <w:t xml:space="preserve">type here</w:t>
+                  <w:t xml:space="preserve">MEMBER TO COMPLETE</w:t>
                 </w:r>
               </w:sdtContent>
             </w:sdt>
@@ -13078,7 +12949,6 @@
       </w:tr>
       <w:tr>
         <w:trPr>
-          <w:trHeight w:val="454" w:hRule="atLeast"/>
           <w:cantSplit/>
         </w:trPr>
         <w:tc>
@@ -13130,7 +13000,7 @@
                 <w:r>
                   <w:rPr>
                     <w:sz w:val="14"/>
-                    <w:szCs w:val="14"/>
+                    <w:highlight w:val="yellow"/>
                   </w:rPr>
                   <w:t xml:space="preserve">Select ▾</w:t>
                 </w:r>
@@ -13162,9 +13032,9 @@
                 <w:r>
                   <w:rPr>
                     <w:sz w:val="14"/>
-                    <w:szCs w:val="14"/>
+                    <w:highlight w:val="yellow"/>
                   </w:rPr>
-                  <w:t xml:space="preserve">type here</w:t>
+                  <w:t xml:space="preserve">MEMBER TO COMPLETE</w:t>
                 </w:r>
               </w:sdtContent>
             </w:sdt>
@@ -13194,9 +13064,9 @@
                 <w:r>
                   <w:rPr>
                     <w:sz w:val="14"/>
-                    <w:szCs w:val="14"/>
+                    <w:highlight w:val="yellow"/>
                   </w:rPr>
-                  <w:t xml:space="preserve">type here</w:t>
+                  <w:t xml:space="preserve">MEMBER TO COMPLETE</w:t>
                 </w:r>
               </w:sdtContent>
             </w:sdt>
@@ -13205,7 +13075,6 @@
       </w:tr>
       <w:tr>
         <w:trPr>
-          <w:trHeight w:val="454" w:hRule="atLeast"/>
           <w:cantSplit/>
         </w:trPr>
         <w:tc>
@@ -13255,7 +13124,7 @@
                 <w:r>
                   <w:rPr>
                     <w:sz w:val="14"/>
-                    <w:szCs w:val="14"/>
+                    <w:highlight w:val="yellow"/>
                   </w:rPr>
                   <w:t xml:space="preserve">Select ▾</w:t>
                 </w:r>
@@ -13286,9 +13155,9 @@
                 <w:r>
                   <w:rPr>
                     <w:sz w:val="14"/>
-                    <w:szCs w:val="14"/>
+                    <w:highlight w:val="yellow"/>
                   </w:rPr>
-                  <w:t xml:space="preserve">type here</w:t>
+                  <w:t xml:space="preserve">MEMBER TO COMPLETE</w:t>
                 </w:r>
               </w:sdtContent>
             </w:sdt>
@@ -13317,9 +13186,9 @@
                 <w:r>
                   <w:rPr>
                     <w:sz w:val="14"/>
-                    <w:szCs w:val="14"/>
+                    <w:highlight w:val="yellow"/>
                   </w:rPr>
-                  <w:t xml:space="preserve">type here</w:t>
+                  <w:t xml:space="preserve">MEMBER TO COMPLETE</w:t>
                 </w:r>
               </w:sdtContent>
             </w:sdt>
@@ -13848,7 +13717,6 @@
       </w:tr>
       <w:tr>
         <w:trPr>
-          <w:trHeight w:val="454" w:hRule="atLeast"/>
           <w:cantSplit/>
         </w:trPr>
         <w:tc>
@@ -13899,8 +13767,8 @@
               <w:sdtContent>
                 <w:r>
                   <w:rPr>
-                    <w:sz w:val="15"/>
-                    <w:szCs w:val="15"/>
+                    <w:sz w:val="14"/>
+                    <w:highlight w:val="yellow"/>
                   </w:rPr>
                   <w:t xml:space="preserve">Select ▾</w:t>
                 </w:r>
@@ -13935,8 +13803,8 @@
               <w:sdtContent>
                 <w:r>
                   <w:rPr>
-                    <w:sz w:val="15"/>
-                    <w:szCs w:val="15"/>
+                    <w:sz w:val="14"/>
+                    <w:highlight w:val="yellow"/>
                   </w:rPr>
                   <w:t xml:space="preserve">Select ▾</w:t>
                 </w:r>
@@ -13971,8 +13839,8 @@
               <w:sdtContent>
                 <w:r>
                   <w:rPr>
-                    <w:sz w:val="15"/>
-                    <w:szCs w:val="15"/>
+                    <w:sz w:val="14"/>
+                    <w:highlight w:val="yellow"/>
                   </w:rPr>
                   <w:t xml:space="preserve">Select ▾</w:t>
                 </w:r>
@@ -13985,9 +13853,12 @@
             <w:tcW w:type="dxa" w:w="2211"/>
           </w:tcPr>
           <w:p>
-            <w:pPr>
-              <w:keepNext/>
-            </w:pPr>
+            <w:r>
+              <w:rPr>
+                <w:highlight w:val="yellow"/>
+              </w:rPr>
+              <w:t>SIGN PERSONALLY</w:t>
+            </w:r>
           </w:p>
         </w:tc>
         <w:tc>
@@ -14017,8 +13888,8 @@
               <w:sdtContent>
                 <w:r>
                   <w:rPr>
-                    <w:sz w:val="15"/>
-                    <w:szCs w:val="15"/>
+                    <w:sz w:val="14"/>
+                    <w:highlight w:val="yellow"/>
                   </w:rPr>
                   <w:t xml:space="preserve">Select ▾</w:t>
                 </w:r>
@@ -14029,7 +13900,6 @@
       </w:tr>
       <w:tr>
         <w:trPr>
-          <w:trHeight w:val="454" w:hRule="atLeast"/>
           <w:cantSplit/>
         </w:trPr>
         <w:tc>
@@ -14080,8 +13950,8 @@
               <w:sdtContent>
                 <w:r>
                   <w:rPr>
-                    <w:sz w:val="15"/>
-                    <w:szCs w:val="15"/>
+                    <w:sz w:val="14"/>
+                    <w:highlight w:val="yellow"/>
                   </w:rPr>
                   <w:t xml:space="preserve">Select ▾</w:t>
                 </w:r>
@@ -14116,8 +13986,8 @@
               <w:sdtContent>
                 <w:r>
                   <w:rPr>
-                    <w:sz w:val="15"/>
-                    <w:szCs w:val="15"/>
+                    <w:sz w:val="14"/>
+                    <w:highlight w:val="yellow"/>
                   </w:rPr>
                   <w:t xml:space="preserve">Select ▾</w:t>
                 </w:r>
@@ -14152,8 +14022,8 @@
               <w:sdtContent>
                 <w:r>
                   <w:rPr>
-                    <w:sz w:val="15"/>
-                    <w:szCs w:val="15"/>
+                    <w:sz w:val="14"/>
+                    <w:highlight w:val="yellow"/>
                   </w:rPr>
                   <w:t xml:space="preserve">Select ▾</w:t>
                 </w:r>
@@ -14166,9 +14036,12 @@
             <w:tcW w:type="dxa" w:w="2211"/>
           </w:tcPr>
           <w:p>
-            <w:pPr>
-              <w:keepNext/>
-            </w:pPr>
+            <w:r>
+              <w:rPr>
+                <w:highlight w:val="yellow"/>
+              </w:rPr>
+              <w:t>SIGN PERSONALLY</w:t>
+            </w:r>
           </w:p>
         </w:tc>
         <w:tc>
@@ -14198,8 +14071,8 @@
               <w:sdtContent>
                 <w:r>
                   <w:rPr>
-                    <w:sz w:val="15"/>
-                    <w:szCs w:val="15"/>
+                    <w:sz w:val="14"/>
+                    <w:highlight w:val="yellow"/>
                   </w:rPr>
                   <w:t xml:space="preserve">Select ▾</w:t>
                 </w:r>
@@ -14210,7 +14083,6 @@
       </w:tr>
       <w:tr>
         <w:trPr>
-          <w:trHeight w:val="454" w:hRule="atLeast"/>
           <w:cantSplit/>
         </w:trPr>
         <w:tc>
@@ -14259,8 +14131,8 @@
               <w:sdtContent>
                 <w:r>
                   <w:rPr>
-                    <w:sz w:val="15"/>
-                    <w:szCs w:val="15"/>
+                    <w:sz w:val="14"/>
+                    <w:highlight w:val="yellow"/>
                   </w:rPr>
                   <w:t xml:space="preserve">Select ▾</w:t>
                 </w:r>
@@ -14294,8 +14166,8 @@
               <w:sdtContent>
                 <w:r>
                   <w:rPr>
-                    <w:sz w:val="15"/>
-                    <w:szCs w:val="15"/>
+                    <w:sz w:val="14"/>
+                    <w:highlight w:val="yellow"/>
                   </w:rPr>
                   <w:t xml:space="preserve">Select ▾</w:t>
                 </w:r>
@@ -14329,8 +14201,8 @@
               <w:sdtContent>
                 <w:r>
                   <w:rPr>
-                    <w:sz w:val="15"/>
-                    <w:szCs w:val="15"/>
+                    <w:sz w:val="14"/>
+                    <w:highlight w:val="yellow"/>
                   </w:rPr>
                   <w:t xml:space="preserve">Select ▾</w:t>
                 </w:r>
@@ -14342,7 +14214,14 @@
           <w:tcPr>
             <w:tcW w:type="dxa" w:w="2211"/>
           </w:tcPr>
-          <w:p/>
+          <w:p>
+            <w:r>
+              <w:rPr>
+                <w:highlight w:val="yellow"/>
+              </w:rPr>
+              <w:t>SIGN PERSONALLY</w:t>
+            </w:r>
+          </w:p>
         </w:tc>
         <w:tc>
           <w:tcPr>
@@ -14370,8 +14249,8 @@
               <w:sdtContent>
                 <w:r>
                   <w:rPr>
-                    <w:sz w:val="15"/>
-                    <w:szCs w:val="15"/>
+                    <w:sz w:val="14"/>
+                    <w:highlight w:val="yellow"/>
                   </w:rPr>
                   <w:t xml:space="preserve">Select ▾</w:t>
                 </w:r>
@@ -14394,6 +14273,113 @@
           <w:sz w:val="14"/>
         </w:rPr>
         <w:t>*Optional: may Dr. Nanade use anonymised data from this dossier and repository in education research publications? Your answer has no effect on your marks, and you can withdraw until results are published.</w:t>
+      </w:r>
+    </w:p>
+    <w:p>
+      <w:r>
+        <w:br w:type="page"/>
+      </w:r>
+    </w:p>
+    <w:p>
+      <w:pPr>
+        <w:pStyle w:val="Heading1"/>
+      </w:pPr>
+      <w:r>
+        <w:t>Appendix A · Evidence scope and final evaluation</w:t>
+      </w:r>
+    </w:p>
+    <w:p>
+      <w:r>
+        <w:t>PRELIMINARY REVIEW COPY — frozen final validation is still running. Historical tracking data and nominal development evidence are labelled separately. Replace this copy after the final batch and business recalibration finish.</w:t>
+      </w:r>
+    </w:p>
+    <w:p>
+      <w:r>
+        <w:t>Validated development movie (not independent statistical replication): CLEAN_AND_HOME at 610.858 simulated seconds; 32/32 selected irregular deposits below the residual threshold; qualifying whole-panel footprint 89.97917% (the exact-90% flag is false). Maximum rise above initial normal height 0.408684 mm; maximum tilt 0.093728°. Physical 120 g block leaves glass and is retained by the permanent tray. Initial dust inventory 4 g; final station 3.985638 g; residual glass 14.3625 mg; mass balance error 8.67e-19 kg. Final recording and headless nominal telemetry match exactly.</w:t>
+      </w:r>
+    </w:p>
+    <w:p>
+      <w:pPr>
+        <w:pStyle w:val="Heading2"/>
+      </w:pPr>
+      <w:r>
+        <w:t>Engineering limitations and interpretation</w:t>
+      </w:r>
+    </w:p>
+    <w:p>
+      <w:r>
+        <w:t>Real RGB images drive contamination detection, persistence, targeted slowdowns/revisits and the departure decision. Navigation uses simulator ground-truth pose. Controlled colour/lighting segmentation is not a trained general debris detector. Two actual overhead sensor cameras and the onboard camera have visible equipment representations; scenery is isolated from validated sensor RGB. Clean/subthreshold development tests remain at home. General coloured/wet/shadowed dirt and arbitrary solid collection are unvalidated.</w:t>
+      </w:r>
+    </w:p>
+    <w:p>
+      <w:r>
+        <w:t>Dust removal is a contact-gated exponential layer/mass proxy, transferred to a modelled onboard bin and then station; there is no CFD vacuum or granular dust transport. The larger block has actual gravity/collision pushing, but its release corridor is prescribed. Four driven rollers approximate tracks. Zero-friction physical guards provide containment; they are not proof of real-world grip or safe operation on an unguarded panel. Soft contact permits small penetration. Scratch, wear, motor, battery, structural mounting and electrical charging safety require hardware tests. The modelled 30 W dock service credits energy over eight seconds; it is not a demonstrated full recharge.</w:t>
+      </w:r>
+    </w:p>
+    <w:p>
+      <w:r>
+        <w:t>FMEA scores are ordinal engineering judgements, not fitted failure rates. Severity and occurrence stay unchanged; any post-RPN reduction credits only the specified code/logged evaluation detection. No reduction is credited to untested coating protection. The business case assumes one cleaner repeatedly services separately transferred 24 m² bays. 504 m²/day is a workload scenario, not an inferred 100 kWp plant. Energy efficiency/auxiliary loads are assumptions; PV electrical yield is neither simulated nor monetised.</w:t>
+      </w:r>
+    </w:p>
+    <w:p>
+      <w:pPr>
+        <w:pStyle w:val="Heading1"/>
+      </w:pPr>
+      <w:r>
+        <w:t>Appendix B · References and source verification</w:t>
+      </w:r>
+    </w:p>
+    <w:p>
+      <w:r>
+        <w:t>The five entries below have bibliographic metadata verified in official or author-maintained software repositories. This does not imply access to all full articles or verification of a numerical PV-loss claim. The original authorised title is preserved as a question; its 15–18% phrase is not established by this work. See submission/source_audit/source_access.json for pinned commits, hashes and access scope.</w:t>
+      </w:r>
+    </w:p>
+    <w:p>
+      <w:r>
+        <w:t>[1] E. Todorov, T. Erez and Y. Tassa, “MuJoCo: A physics engine for model-based control,” IROS, pp. 5026–5033, 2012. DOI: 10.1109/IROS.2012.6386109. MuJoCo simulator context; developer README citation metadata verified.</w:t>
+      </w:r>
+    </w:p>
+    <w:p>
+      <w:r>
+        <w:t>[2] W. F. Holmgren, C. W. Hansen and M. A. Mikofski, “pvlib python: a python package for modeling solar energy systems,” JOSS 3(29), 884, 2018. DOI: 10.21105/joss.00884. PV modelling software context; official README metadata, not a PV-yield calculation in this project.</w:t>
+      </w:r>
+    </w:p>
+    <w:p>
+      <w:r>
+        <w:t>[3] K. S. Anderson et al., “pvlib python: 2023 project update,” JOSS 8(92), 5994, 2023. DOI: 10.21105/joss.05994. PV modelling context; official README metadata verified.</w:t>
+      </w:r>
+    </w:p>
+    <w:p>
+      <w:r>
+        <w:t>[4] M. G. Deceglie, L. Micheli and M. Muller, “Quantifying Soiling Loss Directly From PV Yield,” IEEE Journal of Photovoltaics 8(2), pp. 547–551, 2018. DOI: 10.1109/JPHOTOV.2017.2784682. Yield-based soiling measurement is separate from a dust-removal proxy; author-maintained rdtools README metadata only, full article not accessed.</w:t>
+      </w:r>
+    </w:p>
+    <w:p>
+      <w:r>
+        <w:t>[5] D. C. Jordan et al., “Robust PV Degradation Methodology and Application,” IEEE Journal of Photovoltaics 8(2), pp. 525–531, 2018. DOI: 10.1109/JPHOTOV.2017.2779779. Yield/degradation analysis context; author-maintained rdtools README metadata only, full article not accessed.</w:t>
+      </w:r>
+    </w:p>
+    <w:p>
+      <w:r>
+        <w:t>MuJoCo developer documentation (official source, pinned in source_access.json): contact friction coefficients, geom priority and solref/solimp interpretation. IEC 61215/61730 licensed clauses were not accessed; no invented clause or certified glass-load limit is used. Historical literature scaffolds and SIMULATED_* starter outputs are excluded from final evidence.</w:t>
+      </w:r>
+    </w:p>
+    <w:p>
+      <w:pPr>
+        <w:pStyle w:val="Heading1"/>
+      </w:pPr>
+      <w:r>
+        <w:t>Appendix C · Reproduction and remaining team actions</w:t>
+      </w:r>
+    </w:p>
+    <w:p>
+      <w:r>
+        <w:t>From the group directory, use the pinned Python environment in requirements.txt. Headless execution requires MUJOCO_GL=egl before importing MuJoCo. Commands and archive manifest: submission/REPRODUCE.md. Final raw files are CSV text compressed with XZ; Python pandas.read_csv reads them directly. Original field tags/choices are preserved in this Word file; edit controls in desktop Word, not Google Docs. Historical tracking CSVs use .csv.gz compression.</w:t>
+      </w:r>
+    </w:p>
+    <w:p>
+      <w:r>
+        <w:t>Team: review all technical claims and code; fill genuine authorship, individual hours/learning/AI declarations and optional research consent; complete actual Group 07/12 peer reviews; record and post a 3–4 minute team presentation with all three speaking/webcam, simulation and business graph; insert its URL; each member signs personally; export the matching final PDF. Commit Word/PDF to the faculty group docs folder and every member turns in the PDF on Teams. Deadline: 26-Oct-2026, 23:59 IST.</w:t>
       </w:r>
     </w:p>
     <w:sectPr>

</xml_diff>

<commit_message>
State full labour accounting and negative cost-reduction cases in dossier
</commit_message>
<xml_diff>
--- a/Group_06_Arush_Ronit_Harshvardhan/docs/MDRIIA_Group_06_Technical_Dossier.docx
+++ b/Group_06_Arush_Ronit_Harshvardhan/docs/MDRIIA_Group_06_Technical_Dossier.docx
@@ -4736,19 +4736,8 @@
             <w:tcW w:type="dxa" w:w="3515"/>
           </w:tcPr>
           <w:p>
-            <w:pPr>
-              <w:keepNext/>
-              <w:spacing w:after="0"/>
-            </w:pPr>
-            <w:r/>
             <w:r>
-              <w:rPr>
-                <w:b w:val="0"/>
-                <w:i w:val="0"/>
-                <w:color w:val="000000"/>
-                <w:sz w:val="13"/>
-              </w:rPr>
-              <w:t>H = contractor cleaning hours per month replaced by the crawler (person-hours/month)</w:t>
+              <w:t>Hreclaimed = H0 − [f·n·Ta/(3600p) + n·(ttransfer + (1−p)·trecovery/p)/3600 + Hmaintenance]. n=sections/month; Ta=mean attempt seconds; p=success fraction; f=supervision fraction; all transfer/recovery is human labour in the base scenario.</w:t>
             </w:r>
           </w:p>
         </w:tc>
@@ -4954,19 +4943,8 @@
             <w:tcW w:type="dxa" w:w="3515"/>
           </w:tcPr>
           <w:p>
-            <w:pPr>
-              <w:keepNext/>
-              <w:spacing w:after="0"/>
-            </w:pPr>
-            <w:r/>
             <w:r>
-              <w:rPr>
-                <w:b w:val="0"/>
-                <w:i w:val="0"/>
-                <w:color w:val="000000"/>
-                <w:sz w:val="13"/>
-              </w:rPr>
-              <w:t>NCRI = (C_baseline − C_robot) / C_baseline  (0–1);  cost-parity ratio κ = C_robot / C_baseline = 1 − NCRI</w:t>
+              <w:t>NCRI = 1 − κ; κ = annual robot-system cost / annual manual baseline cost. Costs are normalised to one baseline year. NCRI can be negative; payback is undefined when annual savings ≤ 0.</w:t>
             </w:r>
           </w:p>
         </w:tc>

</xml_diff>

<commit_message>
Complete frozen evaluation, business analysis and technical review bundle
</commit_message>
<xml_diff>
--- a/Group_06_Arush_Ronit_Harshvardhan/docs/MDRIIA_Group_06_Technical_Dossier.docx
+++ b/Group_06_Arush_Ronit_Harshvardhan/docs/MDRIIA_Group_06_Technical_Dossier.docx
@@ -71,7 +71,7 @@
           <w:color w:val="9C3025"/>
         </w:rPr>
         <w:br/>
-        <w:t>PRELIMINARY REVIEW COPY — final validation running; team fields unsigned.</w:t>
+        <w:t>TECHNICAL REVIEW COPY — member declarations, video, peer reviews and signatures pending.</w:t>
       </w:r>
     </w:p>
     <w:tbl>
@@ -4766,7 +4766,7 @@
                   <w:rPr>
                     <w:sz w:val="14"/>
                   </w:rPr>
-                  <w:t xml:space="preserve">PROVISIONAL calibration: one validated nominal run; final batch pending. H0=120 h/month; 21 sections/day × 30 days; f=0.2; attempt mean 610.858 s; p=1; transfer=180 s/section fully human; recovery=180 s/failure fully human; maintenance=10 h/month. All commercial values are assumptions.</w:t>
+                  <w:t xml:space="preserve">All 30 proposed attempts at 20°, failures retained. H0=120 h/month; 21 sections/day × 30 days; f=0.2; attempt mean 612.713 s; p=1; transfer=180 s/section fully human; recovery=180 s/failure fully human; maintenance=10 h/month. All commercial values are assumptions.</w:t>
                 </w:r>
               </w:sdtContent>
             </w:sdt>
@@ -4797,7 +4797,7 @@
                   <w:rPr>
                     <w:sz w:val="14"/>
                   </w:rPr>
-                  <w:t xml:space="preserve">57.12 person-h/month; robot-related human effort 62.88 h/month (monitoring + transfer/recovery + maintenance).</w:t>
+                  <w:t xml:space="preserve">57.055 person-h/month; robot-related human effort 62.945 h/month (monitoring + transfer/recovery + maintenance).</w:t>
                 </w:r>
               </w:sdtContent>
             </w:sdt>
@@ -4906,7 +4906,7 @@
                   <w:rPr>
                     <w:sz w:val="14"/>
                   </w:rPr>
-                  <w:t xml:space="preserve">T=20.491 months; P=0.34152 (dimensionless). Scenario output, not observed payback.</w:t>
+                  <w:t xml:space="preserve">T=20.522 months; P=0.34204 (dimensionless). Scenario output, not observed payback.</w:t>
                 </w:r>
               </w:sdtContent>
             </w:sdt>
@@ -5004,7 +5004,7 @@
                   <w:rPr>
                     <w:sz w:val="14"/>
                   </w:rPr>
-                  <w:t xml:space="preserve">κ=0.61935; NCRI=1−κ=0.38065. Estimated system energy 51.162 kWh/year under scenario assumptions; not measured electrical energy.</w:t>
+                  <w:t xml:space="preserve">κ=0.61993; NCRI=1−κ=0.38007. Estimated system energy 51.281 kWh/year under scenario assumptions; not measured electrical energy.</w:t>
                 </w:r>
               </w:sdtContent>
             </w:sdt>
@@ -5082,7 +5082,7 @@
                   <w:rPr>
                     <w:sz w:val="14"/>
                   </w:rPr>
-                  <w:t xml:space="preserve">A section is one 24 m² bay, not a raster lane. λ=2.625 sections/h; μ=3600/[E(Tattempt)/p + (1−p)·180/p + 180]=4.55202 sections/h; c=1. Poisson arrivals/exponential service assumed.</w:t>
+                  <w:t xml:space="preserve">A section is one 24 m² bay, not a raster lane. λ=2.625 sections/h; μ=3600/[E(Tattempt)/p + (1−p)·180/p + 180]=4.54137 sections/h; c=1. Poisson arrivals/exponential service assumed.</w:t>
                 </w:r>
               </w:sdtContent>
             </w:sdt>
@@ -5113,7 +5113,7 @@
                   <w:rPr>
                     <w:sz w:val="14"/>
                   </w:rPr>
-                  <w:t xml:space="preserve">ρ=0.57667; Wq=17.955 min if stable. Mean service 790.858 s. M/M/1 distribution assumptions are not validated by the simulator.</w:t>
+                  <w:t xml:space="preserve">ρ=0.57802; Wq=18.097 min if stable. Mean service 792.713 s. M/M/1 distribution assumptions are not validated by the simulator.</w:t>
                 </w:r>
               </w:sdtContent>
             </w:sdt>
@@ -5218,7 +5218,7 @@
                   <w:rPr>
                     <w:sz w:val="14"/>
                   </w:rPr>
-                  <w:t xml:space="preserve">Break-even supervision fraction f=0.6273; maximum k for payback within assumed life=1.9033. Negative NCRI and unstable queues are retained, not converted to finite payback.</w:t>
+                  <w:t xml:space="preserve">Break-even supervision fraction f=0.62536; maximum k for payback within assumed life=1.9004. Negative NCRI and unstable queues are retained, not converted to finite payback.</w:t>
                 </w:r>
               </w:sdtContent>
             </w:sdt>
@@ -5357,7 +5357,7 @@
                   <w:rPr>
                     <w:sz w:val="14"/>
                   </w:rPr>
-                  <w:t xml:space="preserve">λ=2.625 sections/h; μ=4.55202 sections/h; c=1; ρ=0.57667</w:t>
+                  <w:t xml:space="preserve">λ=2.625 sections/h; μ=4.54137 sections/h; c=1; ρ=0.57802</w:t>
                 </w:r>
               </w:sdtContent>
             </w:sdt>
@@ -5415,7 +5415,7 @@
                   <w:rPr>
                     <w:sz w:val="14"/>
                   </w:rPr>
-                  <w:t xml:space="preserve">20.4912 months; assumed scenario</w:t>
+                  <w:t xml:space="preserve">20.5223 months; assumed scenario</w:t>
                 </w:r>
               </w:sdtContent>
             </w:sdt>
@@ -7903,7 +7903,7 @@
                   <w:rPr>
                     <w:sz w:val="14"/>
                   </w:rPr>
-                  <w:t xml:space="preserve">PRELIMINARY: historical 30 s initial-sweep study on the earlier model, baseline waypoint/P vs proposed lookahead/PI. This is not a final collection-system study. A separate frozen 180 full-mission batch is running; do not merge datasets.</w:t>
+                  <w:t xml:space="preserve">Final collection model: waypoint reference + P wheel control versus segment lookahead + PI. Same camera pipeline, fixed brush/guide, mission route, guard, safety and shared incline/return regulator. Primary endpoint is common 0–30 s RMSE; all attempts continue through full mission/abort/1000 s.</w:t>
                 </w:r>
               </w:sdtContent>
             </w:sdt>
@@ -7961,7 +7961,7 @@
                   <w:rPr>
                     <w:sz w:val="14"/>
                   </w:rPr>
-                  <w:t xml:space="preserve">Historical study: 30 baseline + 30 proposed at nominal 20°. Final model: planned 30/controller/tilt × 10°,20°,30° = 180; pending.</w:t>
+                  <w:t xml:space="preserve">30 independent runs/controller/tilt; 10°,20°,30°; 180 full-mission attempts. All failures retained. Table below: prespecified nominal 20°; all conditions in Appendix A.</w:t>
                 </w:r>
               </w:sdtContent>
             </w:sdt>
@@ -8019,7 +8019,7 @@
                   <w:rPr>
                     <w:sz w:val="14"/>
                   </w:rPr>
-                  <w:t xml:space="preserve">Historical protocol records independent initial-pose seeds. Final protocol: initial x/y U(−0.01,+0.01) m and independent dust shape/offset seed; dry friction fixed. No wet-glass/random-colour challenge is claimed.</w:t>
+                  <w:t xml:space="preserve">Initial x/y independent U(−0.01,+0.01) m; dust shape/offset RNG independent through logged debris_seed; clusters and 120 g lower-strip corridor fixed. Dry friction fixed. Seeds/distributions frozen before execution.</w:t>
                 </w:r>
               </w:sdtContent>
             </w:sdt>
@@ -8195,7 +8195,7 @@
                   <w:rPr>
                     <w:sz w:val="14"/>
                   </w:rPr>
-                  <w:t xml:space="preserve">Historical: analytics/tracking_benchmark/*_real_trials.csv (see protocol.json). Pending final: analytics/final_validation_v1/tilt_*/{variant}_{seed}/telemetry.csv.xz.</w:t>
+                  <w:t xml:space="preserve">analytics/final_validation_v1/tilt_{10,20,30}/{baseline,proposed}_{seed}/telemetry.csv.xz; summary.csv, protocol.json, statistics.json and trace_audit.json. A run, not a 500 Hz sample, is the unit of inference.</w:t>
                 </w:r>
               </w:sdtContent>
             </w:sdt>
@@ -8411,7 +8411,7 @@
                   <w:rPr>
                     <w:sz w:val="14"/>
                   </w:rPr>
-                  <w:t xml:space="preserve">30 per controller; historical only</w:t>
+                  <w:t xml:space="preserve">Available 30 s windows: 30 baseline / 30 proposed; 30 attempts each</w:t>
                 </w:r>
               </w:sdtContent>
             </w:sdt>
@@ -8442,7 +8442,7 @@
                   <w:rPr>
                     <w:sz w:val="14"/>
                   </w:rPr>
-                  <w:t xml:space="preserve">0.1168456 ± 0.0010838</w:t>
+                  <w:t xml:space="preserve">0.100061 ± 0.0012</w:t>
                 </w:r>
               </w:sdtContent>
             </w:sdt>
@@ -8473,7 +8473,7 @@
                   <w:rPr>
                     <w:sz w:val="14"/>
                   </w:rPr>
-                  <w:t xml:space="preserve">0.0227479 ± 0.0004936</w:t>
+                  <w:t xml:space="preserve">0.0118225 ± 0.000166</w:t>
                 </w:r>
               </w:sdtContent>
             </w:sdt>
@@ -8504,7 +8504,7 @@
                   <w:rPr>
                     <w:sz w:val="14"/>
                   </w:rPr>
-                  <w:t xml:space="preserve">m; 0–30 s geometric error</w:t>
+                  <w:t xml:space="preserve">m; common 0–30 s</w:t>
                 </w:r>
               </w:sdtContent>
             </w:sdt>
@@ -8596,7 +8596,7 @@
                   <w:rPr>
                     <w:sz w:val="14"/>
                   </w:rPr>
-                  <w:t xml:space="preserve">Final study pending</w:t>
+                  <w:t xml:space="preserve">Available 30 s windows: 30 baseline / 30 proposed; 30 attempts each</w:t>
                 </w:r>
               </w:sdtContent>
             </w:sdt>
@@ -8627,7 +8627,7 @@
                   <w:rPr>
                     <w:sz w:val="14"/>
                   </w:rPr>
-                  <w:t xml:space="preserve">Pending frozen final batch</w:t>
+                  <w:t xml:space="preserve">30.5728 ± 0.162</w:t>
                 </w:r>
               </w:sdtContent>
             </w:sdt>
@@ -8658,7 +8658,7 @@
                   <w:rPr>
                     <w:sz w:val="14"/>
                   </w:rPr>
-                  <w:t xml:space="preserve">Pending frozen final batch</w:t>
+                  <w:t xml:space="preserve">31.1333 ± 0.201</w:t>
                 </w:r>
               </w:sdtContent>
             </w:sdt>
@@ -8689,7 +8689,7 @@
                   <w:rPr>
                     <w:sz w:val="14"/>
                   </w:rPr>
-                  <w:t xml:space="preserve">N²·m²·s</w:t>
+                  <w:t xml:space="preserve">N²·m²·s; 0–30 s</w:t>
                 </w:r>
               </w:sdtContent>
             </w:sdt>
@@ -8759,7 +8759,7 @@
                   <w:rPr>
                     <w:sz w:val="14"/>
                   </w:rPr>
-                  <w:t xml:space="preserve">Final-model nominal combined demonstration (not a controller comparison)</w:t>
+                  <w:t xml:space="preserve">Complete safe, camera-clean, solid-retained, serviced home cycle</w:t>
                 </w:r>
               </w:sdtContent>
             </w:sdt>
@@ -8789,7 +8789,7 @@
                   <w:rPr>
                     <w:sz w:val="14"/>
                   </w:rPr>
-                  <w:t xml:space="preserve">1 development validation + identical recording</w:t>
+                  <w:t xml:space="preserve">30 per controller at 20°</w:t>
                 </w:r>
               </w:sdtContent>
             </w:sdt>
@@ -8819,7 +8819,7 @@
                   <w:rPr>
                     <w:sz w:val="14"/>
                   </w:rPr>
-                  <w:t xml:space="preserve">Not assessed in nominal development demonstration</w:t>
+                  <w:t xml:space="preserve">30/30 (100.00%)</w:t>
                 </w:r>
               </w:sdtContent>
             </w:sdt>
@@ -8849,7 +8849,7 @@
                   <w:rPr>
                     <w:sz w:val="14"/>
                   </w:rPr>
-                  <w:t xml:space="preserve">CLEAN_AND_HOME at 610.858 s; 32/32 patches below threshold; 120 g solid retained; 89.97917% whole-panel footprint</w:t>
+                  <w:t xml:space="preserve">30/30 (100.00%)</w:t>
                 </w:r>
               </w:sdtContent>
             </w:sdt>
@@ -8879,7 +8879,7 @@
                   <w:rPr>
                     <w:sz w:val="14"/>
                   </w:rPr>
-                  <w:t xml:space="preserve">status; s; %</w:t>
+                  <w:t xml:space="preserve">completion fraction</w:t>
                 </w:r>
               </w:sdtContent>
             </w:sdt>
@@ -9053,7 +9053,7 @@
                   <w:rPr>
                     <w:sz w:val="14"/>
                   </w:rPr>
-                  <w:t xml:space="preserve">HISTORICAL only: t=-432.7779, df=40.5339, p=6.62045e-76; tiny seed variance and narrow scope limit interpretation.</w:t>
+                  <w:t xml:space="preserve">20°: t=-400.1377, df=30.11906, p=1.127902e-57; Holm-adjusted p=1.127902e-57 across 3 tilt comparisons.</w:t>
                 </w:r>
               </w:sdtContent>
             </w:sdt>
@@ -9111,7 +9111,7 @@
                   <w:rPr>
                     <w:sz w:val="14"/>
                   </w:rPr>
-                  <w:t xml:space="preserve">-111.74278 (proposed minus baseline, historical study only)</w:t>
+                  <w:t xml:space="preserve">-103.3151; pooled SD; proposed minus baseline</w:t>
                 </w:r>
               </w:sdtContent>
             </w:sdt>
@@ -9167,7 +9167,7 @@
                   <w:rPr>
                     <w:sz w:val="14"/>
                   </w:rPr>
-                  <w:t xml:space="preserve">[-0.09453698, -0.09365847] m, historical study only. No final-system statistical result is claimed.</w:t>
+                  <w:t xml:space="preserve">[-0.08868864868975783, -0.08778807408256452] m for proposed minus baseline. Run-level Welch interval; other conditions in Appendix A.</w:t>
                 </w:r>
               </w:sdtContent>
             </w:sdt>
@@ -9206,7 +9206,7 @@
             <w:r>
               <w:drawing>
                 <wp:inline xmlns:a="http://schemas.openxmlformats.org/drawingml/2006/main" xmlns:pic="http://schemas.openxmlformats.org/drawingml/2006/picture">
-                  <wp:extent cx="2880360" cy="1920240"/>
+                  <wp:extent cx="2880360" cy="1975104"/>
                   <wp:docPr id="4" name="Picture 4"/>
                   <wp:cNvGraphicFramePr>
                     <a:graphicFrameLocks noChangeAspect="1"/>
@@ -9215,7 +9215,7 @@
                     <a:graphicData uri="http://schemas.openxmlformats.org/drawingml/2006/picture">
                       <pic:pic>
                         <pic:nvPicPr>
-                          <pic:cNvPr id="0" name="collection_evidence.png"/>
+                          <pic:cNvPr id="0" name="representative_trajectories.png"/>
                           <pic:cNvPicPr/>
                         </pic:nvPicPr>
                         <pic:blipFill>
@@ -9227,7 +9227,7 @@
                         <pic:spPr>
                           <a:xfrm>
                             <a:off x="0" y="0"/>
-                            <a:ext cx="2880360" cy="1920240"/>
+                            <a:ext cx="2880360" cy="1975104"/>
                           </a:xfrm>
                           <a:prstGeom prst="rect"/>
                         </pic:spPr>
@@ -9243,7 +9243,7 @@
               <w:rPr>
                 <w:sz w:val="14"/>
               </w:rPr>
-              <w:t>One completed nominal final-model demonstration; not Monte Carlo evidence.</w:t>
+              <w:t>Prespecified first seeds at 20°; raw logs retained at 500 Hz.</w:t>
             </w:r>
           </w:p>
         </w:tc>
@@ -9257,7 +9257,7 @@
             <w:r>
               <w:drawing>
                 <wp:inline xmlns:a="http://schemas.openxmlformats.org/drawingml/2006/main" xmlns:pic="http://schemas.openxmlformats.org/drawingml/2006/picture">
-                  <wp:extent cx="2880360" cy="1645920"/>
+                  <wp:extent cx="2880360" cy="1099774"/>
                   <wp:docPr id="5" name="Picture 5"/>
                   <wp:cNvGraphicFramePr>
                     <a:graphicFrameLocks noChangeAspect="1"/>
@@ -9266,7 +9266,7 @@
                     <a:graphicData uri="http://schemas.openxmlformats.org/drawingml/2006/picture">
                       <pic:pic>
                         <pic:nvPicPr>
-                          <pic:cNvPr id="0" name="tracking_comparison.png"/>
+                          <pic:cNvPr id="0" name="tracking_and_effort.png"/>
                           <pic:cNvPicPr/>
                         </pic:nvPicPr>
                         <pic:blipFill>
@@ -9278,7 +9278,7 @@
                         <pic:spPr>
                           <a:xfrm>
                             <a:off x="0" y="0"/>
-                            <a:ext cx="2880360" cy="1645920"/>
+                            <a:ext cx="2880360" cy="1099774"/>
                           </a:xfrm>
                           <a:prstGeom prst="rect"/>
                         </pic:spPr>
@@ -9294,7 +9294,7 @@
               <w:rPr>
                 <w:sz w:val="14"/>
               </w:rPr>
-              <w:t>HISTORICAL 30-second earlier-model comparison; kept separate from pending final batch.</w:t>
+              <w:t>All final conditions; 30 independent attempts per controller/tilt.</w:t>
             </w:r>
           </w:p>
         </w:tc>
@@ -14268,12 +14268,538 @@
     </w:p>
     <w:p>
       <w:r>
-        <w:t>PRELIMINARY REVIEW COPY — frozen final validation is still running. Historical tracking data and nominal development evidence are labelled separately. Replace this copy after the final batch and business recalibration finish.</w:t>
+        <w:t>Technical sections populated from the completed frozen validation and reproducible business scenario. Yellow controls, team video, peer reviews and signatures still require actual member input. This is not a signed faculty submission.</w:t>
       </w:r>
     </w:p>
     <w:p>
       <w:r>
         <w:t>Validated development movie (not independent statistical replication): CLEAN_AND_HOME at 610.858 simulated seconds; 32/32 selected irregular deposits below the residual threshold; qualifying whole-panel footprint 89.97917% (the exact-90% flag is false). Maximum rise above initial normal height 0.408684 mm; maximum tilt 0.093728°. Physical 120 g block leaves glass and is retained by the permanent tray. Initial dust inventory 4 g; final station 3.985638 g; residual glass 14.3625 mg; mass balance error 8.67e-19 kg. Final recording and headless nominal telemetry match exactly.</w:t>
+      </w:r>
+    </w:p>
+    <w:tbl>
+      <w:tblPr>
+        <w:tblStyle w:val="TableGrid"/>
+        <w:tblW w:type="auto" w:w="0"/>
+        <w:tblLook w:firstColumn="1" w:firstRow="1" w:lastColumn="0" w:lastRow="0" w:noHBand="0" w:noVBand="1" w:val="04A0"/>
+      </w:tblPr>
+      <w:tblGrid>
+        <w:gridCol w:w="1701"/>
+        <w:gridCol w:w="1701"/>
+        <w:gridCol w:w="1701"/>
+        <w:gridCol w:w="1701"/>
+        <w:gridCol w:w="1701"/>
+        <w:gridCol w:w="1701"/>
+      </w:tblGrid>
+      <w:tr>
+        <w:trPr>
+          <w:cantSplit/>
+        </w:trPr>
+        <w:tc>
+          <w:tcPr>
+            <w:tcW w:type="dxa" w:w="1701"/>
+          </w:tcPr>
+          <w:p>
+            <w:r>
+              <w:t>Tilt</w:t>
+            </w:r>
+          </w:p>
+        </w:tc>
+        <w:tc>
+          <w:tcPr>
+            <w:tcW w:type="dxa" w:w="1701"/>
+          </w:tcPr>
+          <w:p>
+            <w:r>
+              <w:t>Controller</w:t>
+            </w:r>
+          </w:p>
+        </w:tc>
+        <w:tc>
+          <w:tcPr>
+            <w:tcW w:type="dxa" w:w="1701"/>
+          </w:tcPr>
+          <w:p>
+            <w:r>
+              <w:t>Complete cycles</w:t>
+            </w:r>
+          </w:p>
+        </w:tc>
+        <w:tc>
+          <w:tcPr>
+            <w:tcW w:type="dxa" w:w="1701"/>
+          </w:tcPr>
+          <w:p>
+            <w:r>
+              <w:t>0–30 s RMSE mean ± SD (m)</w:t>
+            </w:r>
+          </w:p>
+        </w:tc>
+        <w:tc>
+          <w:tcPr>
+            <w:tcW w:type="dxa" w:w="1701"/>
+          </w:tcPr>
+          <w:p>
+            <w:r>
+              <w:t>Coverage mean (%)</w:t>
+            </w:r>
+          </w:p>
+        </w:tc>
+        <w:tc>
+          <w:tcPr>
+            <w:tcW w:type="dxa" w:w="1701"/>
+          </w:tcPr>
+          <w:p>
+            <w:r>
+              <w:t>Observed duration mean (s)</w:t>
+            </w:r>
+          </w:p>
+        </w:tc>
+      </w:tr>
+      <w:tr>
+        <w:trPr>
+          <w:cantSplit/>
+        </w:trPr>
+        <w:tc>
+          <w:tcPr>
+            <w:tcW w:type="dxa" w:w="1701"/>
+          </w:tcPr>
+          <w:p>
+            <w:r>
+              <w:t>10.0°</w:t>
+            </w:r>
+          </w:p>
+        </w:tc>
+        <w:tc>
+          <w:tcPr>
+            <w:tcW w:type="dxa" w:w="1701"/>
+          </w:tcPr>
+          <w:p>
+            <w:r>
+              <w:t>baseline</w:t>
+            </w:r>
+          </w:p>
+        </w:tc>
+        <w:tc>
+          <w:tcPr>
+            <w:tcW w:type="dxa" w:w="1701"/>
+          </w:tcPr>
+          <w:p>
+            <w:r>
+              <w:t>30/30</w:t>
+            </w:r>
+          </w:p>
+        </w:tc>
+        <w:tc>
+          <w:tcPr>
+            <w:tcW w:type="dxa" w:w="1701"/>
+          </w:tcPr>
+          <w:p>
+            <w:r>
+              <w:t>0.0463282 ± 0.000453</w:t>
+            </w:r>
+          </w:p>
+        </w:tc>
+        <w:tc>
+          <w:tcPr>
+            <w:tcW w:type="dxa" w:w="1701"/>
+          </w:tcPr>
+          <w:p>
+            <w:r>
+              <w:t>88.3802</w:t>
+            </w:r>
+          </w:p>
+        </w:tc>
+        <w:tc>
+          <w:tcPr>
+            <w:tcW w:type="dxa" w:w="1701"/>
+          </w:tcPr>
+          <w:p>
+            <w:r>
+              <w:t>620.954</w:t>
+            </w:r>
+          </w:p>
+        </w:tc>
+      </w:tr>
+      <w:tr>
+        <w:trPr>
+          <w:cantSplit/>
+        </w:trPr>
+        <w:tc>
+          <w:tcPr>
+            <w:tcW w:type="dxa" w:w="1701"/>
+          </w:tcPr>
+          <w:p>
+            <w:r>
+              <w:t>10.0°</w:t>
+            </w:r>
+          </w:p>
+        </w:tc>
+        <w:tc>
+          <w:tcPr>
+            <w:tcW w:type="dxa" w:w="1701"/>
+          </w:tcPr>
+          <w:p>
+            <w:r>
+              <w:t>proposed</w:t>
+            </w:r>
+          </w:p>
+        </w:tc>
+        <w:tc>
+          <w:tcPr>
+            <w:tcW w:type="dxa" w:w="1701"/>
+          </w:tcPr>
+          <w:p>
+            <w:r>
+              <w:t>30/30</w:t>
+            </w:r>
+          </w:p>
+        </w:tc>
+        <w:tc>
+          <w:tcPr>
+            <w:tcW w:type="dxa" w:w="1701"/>
+          </w:tcPr>
+          <w:p>
+            <w:r>
+              <w:t>0.00372785 ± 0.000159</w:t>
+            </w:r>
+          </w:p>
+        </w:tc>
+        <w:tc>
+          <w:tcPr>
+            <w:tcW w:type="dxa" w:w="1701"/>
+          </w:tcPr>
+          <w:p>
+            <w:r>
+              <w:t>89.976</w:t>
+            </w:r>
+          </w:p>
+        </w:tc>
+        <w:tc>
+          <w:tcPr>
+            <w:tcW w:type="dxa" w:w="1701"/>
+          </w:tcPr>
+          <w:p>
+            <w:r>
+              <w:t>610.025</w:t>
+            </w:r>
+          </w:p>
+        </w:tc>
+      </w:tr>
+      <w:tr>
+        <w:trPr>
+          <w:cantSplit/>
+        </w:trPr>
+        <w:tc>
+          <w:tcPr>
+            <w:tcW w:type="dxa" w:w="1701"/>
+          </w:tcPr>
+          <w:p>
+            <w:r>
+              <w:t>20.0°</w:t>
+            </w:r>
+          </w:p>
+        </w:tc>
+        <w:tc>
+          <w:tcPr>
+            <w:tcW w:type="dxa" w:w="1701"/>
+          </w:tcPr>
+          <w:p>
+            <w:r>
+              <w:t>baseline</w:t>
+            </w:r>
+          </w:p>
+        </w:tc>
+        <w:tc>
+          <w:tcPr>
+            <w:tcW w:type="dxa" w:w="1701"/>
+          </w:tcPr>
+          <w:p>
+            <w:r>
+              <w:t>30/30</w:t>
+            </w:r>
+          </w:p>
+        </w:tc>
+        <w:tc>
+          <w:tcPr>
+            <w:tcW w:type="dxa" w:w="1701"/>
+          </w:tcPr>
+          <w:p>
+            <w:r>
+              <w:t>0.100061 ± 0.0012</w:t>
+            </w:r>
+          </w:p>
+        </w:tc>
+        <w:tc>
+          <w:tcPr>
+            <w:tcW w:type="dxa" w:w="1701"/>
+          </w:tcPr>
+          <w:p>
+            <w:r>
+              <w:t>86.4955</w:t>
+            </w:r>
+          </w:p>
+        </w:tc>
+        <w:tc>
+          <w:tcPr>
+            <w:tcW w:type="dxa" w:w="1701"/>
+          </w:tcPr>
+          <w:p>
+            <w:r>
+              <w:t>747.538</w:t>
+            </w:r>
+          </w:p>
+        </w:tc>
+      </w:tr>
+      <w:tr>
+        <w:trPr>
+          <w:cantSplit/>
+        </w:trPr>
+        <w:tc>
+          <w:tcPr>
+            <w:tcW w:type="dxa" w:w="1701"/>
+          </w:tcPr>
+          <w:p>
+            <w:r>
+              <w:t>20.0°</w:t>
+            </w:r>
+          </w:p>
+        </w:tc>
+        <w:tc>
+          <w:tcPr>
+            <w:tcW w:type="dxa" w:w="1701"/>
+          </w:tcPr>
+          <w:p>
+            <w:r>
+              <w:t>proposed</w:t>
+            </w:r>
+          </w:p>
+        </w:tc>
+        <w:tc>
+          <w:tcPr>
+            <w:tcW w:type="dxa" w:w="1701"/>
+          </w:tcPr>
+          <w:p>
+            <w:r>
+              <w:t>30/30</w:t>
+            </w:r>
+          </w:p>
+        </w:tc>
+        <w:tc>
+          <w:tcPr>
+            <w:tcW w:type="dxa" w:w="1701"/>
+          </w:tcPr>
+          <w:p>
+            <w:r>
+              <w:t>0.0118225 ± 0.000166</w:t>
+            </w:r>
+          </w:p>
+        </w:tc>
+        <w:tc>
+          <w:tcPr>
+            <w:tcW w:type="dxa" w:w="1701"/>
+          </w:tcPr>
+          <w:p>
+            <w:r>
+              <w:t>89.9885</w:t>
+            </w:r>
+          </w:p>
+        </w:tc>
+        <w:tc>
+          <w:tcPr>
+            <w:tcW w:type="dxa" w:w="1701"/>
+          </w:tcPr>
+          <w:p>
+            <w:r>
+              <w:t>612.713</w:t>
+            </w:r>
+          </w:p>
+        </w:tc>
+      </w:tr>
+      <w:tr>
+        <w:trPr>
+          <w:cantSplit/>
+        </w:trPr>
+        <w:tc>
+          <w:tcPr>
+            <w:tcW w:type="dxa" w:w="1701"/>
+          </w:tcPr>
+          <w:p>
+            <w:r>
+              <w:t>30.0°</w:t>
+            </w:r>
+          </w:p>
+        </w:tc>
+        <w:tc>
+          <w:tcPr>
+            <w:tcW w:type="dxa" w:w="1701"/>
+          </w:tcPr>
+          <w:p>
+            <w:r>
+              <w:t>baseline</w:t>
+            </w:r>
+          </w:p>
+        </w:tc>
+        <w:tc>
+          <w:tcPr>
+            <w:tcW w:type="dxa" w:w="1701"/>
+          </w:tcPr>
+          <w:p>
+            <w:r>
+              <w:t>30/30</w:t>
+            </w:r>
+          </w:p>
+        </w:tc>
+        <w:tc>
+          <w:tcPr>
+            <w:tcW w:type="dxa" w:w="1701"/>
+          </w:tcPr>
+          <w:p>
+            <w:r>
+              <w:t>0.165154 ± 0.00114</w:t>
+            </w:r>
+          </w:p>
+        </w:tc>
+        <w:tc>
+          <w:tcPr>
+            <w:tcW w:type="dxa" w:w="1701"/>
+          </w:tcPr>
+          <w:p>
+            <w:r>
+              <w:t>86.2146</w:t>
+            </w:r>
+          </w:p>
+        </w:tc>
+        <w:tc>
+          <w:tcPr>
+            <w:tcW w:type="dxa" w:w="1701"/>
+          </w:tcPr>
+          <w:p>
+            <w:r>
+              <w:t>937.735</w:t>
+            </w:r>
+          </w:p>
+        </w:tc>
+      </w:tr>
+      <w:tr>
+        <w:trPr>
+          <w:cantSplit/>
+        </w:trPr>
+        <w:tc>
+          <w:tcPr>
+            <w:tcW w:type="dxa" w:w="1701"/>
+          </w:tcPr>
+          <w:p>
+            <w:r>
+              <w:t>30.0°</w:t>
+            </w:r>
+          </w:p>
+        </w:tc>
+        <w:tc>
+          <w:tcPr>
+            <w:tcW w:type="dxa" w:w="1701"/>
+          </w:tcPr>
+          <w:p>
+            <w:r>
+              <w:t>proposed</w:t>
+            </w:r>
+          </w:p>
+        </w:tc>
+        <w:tc>
+          <w:tcPr>
+            <w:tcW w:type="dxa" w:w="1701"/>
+          </w:tcPr>
+          <w:p>
+            <w:r>
+              <w:t>30/30</w:t>
+            </w:r>
+          </w:p>
+        </w:tc>
+        <w:tc>
+          <w:tcPr>
+            <w:tcW w:type="dxa" w:w="1701"/>
+          </w:tcPr>
+          <w:p>
+            <w:r>
+              <w:t>0.0290058 ± 0.000328</w:t>
+            </w:r>
+          </w:p>
+        </w:tc>
+        <w:tc>
+          <w:tcPr>
+            <w:tcW w:type="dxa" w:w="1701"/>
+          </w:tcPr>
+          <w:p>
+            <w:r>
+              <w:t>90.0024</w:t>
+            </w:r>
+          </w:p>
+        </w:tc>
+        <w:tc>
+          <w:tcPr>
+            <w:tcW w:type="dxa" w:w="1701"/>
+          </w:tcPr>
+          <w:p>
+            <w:r>
+              <w:t>867.773</w:t>
+            </w:r>
+          </w:p>
+        </w:tc>
+      </w:tr>
+    </w:tbl>
+    <w:p>
+      <w:r>
+        <w:t>10.0°: proposed−baseline Δ=-0.04260033 m; 95% CI [-0.04277804142081319, -0.04242262545673142]; Welch t=-486.1776, df=35.99813, p=2.579979e-70, Holm p=7.739937e-70, Cohen d=-125.5305. Completion Fisher p=1.</w:t>
+      </w:r>
+    </w:p>
+    <w:p>
+      <w:r>
+        <w:t>20.0°: proposed−baseline Δ=-0.08823836 m; 95% CI [-0.08868864868975783, -0.08778807408256452]; Welch t=-400.1377, df=30.11906, p=1.127902e-57, Holm p=1.127902e-57, Cohen d=-103.3151. Completion Fisher p=1.</w:t>
+      </w:r>
+    </w:p>
+    <w:p>
+      <w:r>
+        <w:t>30.0°: proposed−baseline Δ=-0.1361482 m; 95% CI [-0.13658916472867358, -0.1357072431479235]; Welch t=-627.6386, df=33.74324, p=3.260053e-70, Holm p=7.739937e-70, Cohen d=-162.0556. Completion Fisher p=1.</w:t>
+      </w:r>
+    </w:p>
+    <w:p>
+      <w:r>
+        <w:t>Full-run observed RMSE, effort and duration have differing exposure when a run aborts or times out; they are secondary descriptive metrics. All attempts, statuses, independent seeds, raw data and source snapshots are retained. Completion Wilson intervals and raw-trace audits are in statistics.json/trace_audit.json. No controller is declared superior solely because its mean is smaller; use the reported test and scope.</w:t>
+      </w:r>
+    </w:p>
+    <w:p>
+      <w:r>
+        <w:drawing>
+          <wp:inline xmlns:a="http://schemas.openxmlformats.org/drawingml/2006/main" xmlns:pic="http://schemas.openxmlformats.org/drawingml/2006/picture">
+            <wp:extent cx="5943600" cy="2269375"/>
+            <wp:docPr id="6" name="Picture 6"/>
+            <wp:cNvGraphicFramePr>
+              <a:graphicFrameLocks noChangeAspect="1"/>
+            </wp:cNvGraphicFramePr>
+            <a:graphic>
+              <a:graphicData uri="http://schemas.openxmlformats.org/drawingml/2006/picture">
+                <pic:pic>
+                  <pic:nvPicPr>
+                    <pic:cNvPr id="0" name="completion_and_coverage.png"/>
+                    <pic:cNvPicPr/>
+                  </pic:nvPicPr>
+                  <pic:blipFill>
+                    <a:blip r:embed="rId15"/>
+                    <a:stretch>
+                      <a:fillRect/>
+                    </a:stretch>
+                  </pic:blipFill>
+                  <pic:spPr>
+                    <a:xfrm>
+                      <a:off x="0" y="0"/>
+                      <a:ext cx="5943600" cy="2269375"/>
+                    </a:xfrm>
+                    <a:prstGeom prst="rect"/>
+                  </pic:spPr>
+                </pic:pic>
+              </a:graphicData>
+            </a:graphic>
+          </wp:inline>
+        </w:drawing>
       </w:r>
     </w:p>
     <w:p>

</xml_diff>